<commit_message>
Fee model UI (checkout, booking detail, admin controls/earnings) and legal docs via live tokens
</commit_message>
<xml_diff>
--- a/legal/legal-pack.docx
+++ b/legal/legal-pack.docx
@@ -786,7 +786,57 @@
       </w:r>
       <w:r>
         <w:rPr/>
-        <w:t xml:space="preserve"> ₦10 + 0.15 % online; 50 % of that as commission on cash bookings. Is the commission-on-cash model lawful and clearly disclosed? VAT on our fees? </w:t>
+        <w:t xml:space="preserve"> TrimSlot's charge is 2 % of the price (minimum ₦50) on every booking. 50 % of that is owed as commission on cash bookings. Is the commission-on-cash model lawful and clearly disclosed? VAT on our fees? 24a. </w:t>
+      </w:r>
+      <w:r>
+        <w:rPr>
+          <w:rStyle w:val="Strong"/>
+        </w:rPr>
+        <w:t>Booking fee and three-way split of the payment-processor fee.</w:t>
+      </w:r>
+      <w:r>
+        <w:rPr/>
+        <w:t xml:space="preserve"> The payment processor's fee is split between the customer (shown as a "booking fee" line at checkout, currently 33.333 %), the barber (currently 33.333 %, taken from the payout) and TrimSlot (currently 33.334 %). We do not state the processor's fee as a fixed number, because its rates can change. Is this disclosure at checkout and in the Barber Agreement enough? Is a separate "booking fee" line lawful and clear under consumer law? Is VAT charged on it? 24b. </w:t>
+      </w:r>
+      <w:r>
+        <w:rPr>
+          <w:rStyle w:val="Strong"/>
+        </w:rPr>
+        <w:t>Refund of the booking fee.</w:t>
+      </w:r>
+      <w:r>
+        <w:rPr/>
+        <w:t xml:space="preserve"> On a refund because the customer cancelled in time (or the barber could not serve), the app refunds the </w:t>
+      </w:r>
+      <w:r>
+        <w:rPr>
+          <w:rStyle w:val="Strong"/>
+        </w:rPr>
+        <w:t>whole amount charged, including the booking fee</w:t>
+      </w:r>
+      <w:r>
+        <w:rPr/>
+        <w:t xml:space="preserve">. A credit (after a missed booking) is for the </w:t>
+      </w:r>
+      <w:r>
+        <w:rPr>
+          <w:rStyle w:val="Strong"/>
+        </w:rPr>
+        <w:t>price only</w:t>
+      </w:r>
+      <w:r>
+        <w:rPr/>
+        <w:t xml:space="preserve">; the booking fee is not credited. Is that right? May we keep the booking fee on a customer cancellation? 24c. </w:t>
+      </w:r>
+      <w:r>
+        <w:rPr>
+          <w:rStyle w:val="Strong"/>
+        </w:rPr>
+        <w:t>Private share links.</w:t>
+      </w:r>
+      <w:r>
+        <w:rPr/>
+        <w:t xml:space="preserve"> Barbers are no longer listed to all customers. A customer sees a barber only through the barber's private link (or after a booking). Does the link or the saved "My barbers" list raise any privacy, consumer-law or competition concern, and should the Privacy Policy say more? </w:t>
       </w:r>
     </w:p>
     <w:p>
@@ -2001,17 +2051,17 @@
       </w:pPr>
       <w:r>
         <w:rPr/>
-        <w:t xml:space="preserve">3.1 When you book, you choose a barber, a service, a date and a time. Prices are in Nigerian Naira and are fixed when you book. The price shown includes the barber's service price. If you pay online, Paystack may add a </w:t>
-      </w:r>
-      <w:r>
-        <w:rPr>
-          <w:rStyle w:val="Strong"/>
-        </w:rPr>
-        <w:t>payment processing fee</w:t>
-      </w:r>
-      <w:r>
-        <w:rPr/>
-        <w:t xml:space="preserve"> at checkout, which is shown before you pay. [LAWYER/OWNER: confirm who bears this fee and that it is clearly disclosed — see open questions.]</w:t>
+        <w:t xml:space="preserve">3.1 When you book, you choose a barber, a service, a date and a time. Prices are in Nigerian Naira and are fixed when you book. The price shown includes the barber's service price. If you pay online, you also pay a small </w:t>
+      </w:r>
+      <w:r>
+        <w:rPr>
+          <w:rStyle w:val="Strong"/>
+        </w:rPr>
+        <w:t>booking fee</w:t>
+      </w:r>
+      <w:r>
+        <w:rPr/>
+        <w:t>. It is shown as its own line, and the total is shown, before you pay. The booking fee is your share (33.333%) of the payment company's processing fee; the barber and TrimSlot share the rest. We do not quote the payment company's own rates, because they can change. [LAWYER/OWNER: confirm this disclosure — see open questions.]</w:t>
       </w:r>
     </w:p>
     <w:p>
@@ -2498,7 +2548,17 @@
       </w:pPr>
       <w:r>
         <w:rPr/>
-        <w:t>8.1 Customers are not charged a TrimSlot fee for a booking, other than any Paystack processing fee shown at checkout. [OWNER: confirm.]</w:t>
+        <w:t xml:space="preserve">8.1 Customers are not charged a TrimSlot fee for a booking. When you pay online you pay the price plus the </w:t>
+      </w:r>
+      <w:r>
+        <w:rPr>
+          <w:rStyle w:val="Strong"/>
+        </w:rPr>
+        <w:t>booking fee</w:t>
+      </w:r>
+      <w:r>
+        <w:rPr/>
+        <w:t xml:space="preserve"> shown at checkout (see 3.1). Pay-on-arrival bookings, plan sessions and credits have no booking fee. If an online payment is refunded, the booking fee is refunded with it. [OWNER: confirm.]</w:t>
       </w:r>
     </w:p>
     <w:p>
@@ -3702,27 +3762,133 @@
       </w:r>
       <w:r>
         <w:rPr/>
-        <w:t xml:space="preserve"> On each payment made through the app (Pay now, plan purchase), TrimSlot keeps a </w:t>
-      </w:r>
-      <w:r>
-        <w:rPr>
-          <w:rStyle w:val="Strong"/>
-        </w:rPr>
-        <w:t>platform fee</w:t>
-      </w:r>
-      <w:r>
-        <w:rPr/>
-        <w:t xml:space="preserve"> and Paystack sends the rest to your bank account. The platform fee is, at the date of this draft, </w:t>
-      </w:r>
-      <w:r>
-        <w:rPr>
-          <w:rStyle w:val="Strong"/>
-        </w:rPr>
-        <w:t>₦10 plus 0.15% of the price</w:t>
-      </w:r>
-      <w:r>
-        <w:rPr/>
-        <w:t xml:space="preserve"> of the booking or plan. [OWNER: confirm; these are admin-configurable settings, and we can set a different fee for you (including no fee) in writing or in the app.] Paystack's own processing fee is [charged to the customer on top of the price / deducted from the amount you receive — OWNER TO CONFIRM; it is currently added to the customer's payment].</w:t>
+        <w:t xml:space="preserve"> On each payment made through the app (Pay now, plan purchase), the customer pays your price plus a small </w:t>
+      </w:r>
+      <w:r>
+        <w:rPr>
+          <w:rStyle w:val="Strong"/>
+        </w:rPr>
+        <w:t>booking fee</w:t>
+      </w:r>
+      <w:r>
+        <w:rPr/>
+        <w:t xml:space="preserve">. Paystack sends the rest to your bank account after two things are taken from your price: </w:t>
+      </w:r>
+      <w:r>
+        <w:rPr>
+          <w:rStyle w:val="Strong"/>
+        </w:rPr>
+        <w:t>your share of the payment-processor fee</w:t>
+      </w:r>
+      <w:r>
+        <w:rPr/>
+        <w:t xml:space="preserve"> and </w:t>
+      </w:r>
+      <w:r>
+        <w:rPr>
+          <w:rStyle w:val="Strong"/>
+        </w:rPr>
+        <w:t>TrimSlot's charge</w:t>
+      </w:r>
+      <w:r>
+        <w:rPr/>
+        <w:t xml:space="preserve">. So: </w:t>
+      </w:r>
+      <w:r>
+        <w:rPr>
+          <w:rStyle w:val="Emphasis"/>
+        </w:rPr>
+        <w:t>your payout = your price − your share of the processor fee − TrimSlot's charge</w:t>
+      </w:r>
+      <w:r>
+        <w:rPr/>
+        <w:t>. You can see this for every booking in the app, in your bookings and earnings.</w:t>
+      </w:r>
+    </w:p>
+    <w:p>
+      <w:pPr>
+        <w:pStyle w:val="BodyText"/>
+        <w:bidi w:val="0"/>
+        <w:jc w:val="left"/>
+        <w:rPr/>
+      </w:pPr>
+      <w:r>
+        <w:rPr/>
+        <w:t xml:space="preserve">7.1.1 </w:t>
+      </w:r>
+      <w:r>
+        <w:rPr>
+          <w:rStyle w:val="Strong"/>
+        </w:rPr>
+        <w:t>TrimSlot's charge</w:t>
+      </w:r>
+      <w:r>
+        <w:rPr/>
+        <w:t xml:space="preserve"> is, at the date of this draft, </w:t>
+      </w:r>
+      <w:r>
+        <w:rPr>
+          <w:rStyle w:val="Strong"/>
+        </w:rPr>
+        <w:t>2% of the price</w:t>
+      </w:r>
+      <w:r>
+        <w:rPr/>
+        <w:t xml:space="preserve"> (plus ₦0), with a </w:t>
+      </w:r>
+      <w:r>
+        <w:rPr>
+          <w:rStyle w:val="Strong"/>
+        </w:rPr>
+        <w:t>minimum of ₦50</w:t>
+      </w:r>
+      <w:r>
+        <w:rPr/>
+        <w:t>, and never more than the price. [OWNER: confirm; these are admin-configurable settings, and we can set a different charge for you in writing or in the app.]</w:t>
+      </w:r>
+    </w:p>
+    <w:p>
+      <w:pPr>
+        <w:pStyle w:val="BodyText"/>
+        <w:bidi w:val="0"/>
+        <w:jc w:val="left"/>
+        <w:rPr/>
+      </w:pPr>
+      <w:r>
+        <w:rPr/>
+        <w:t xml:space="preserve">7.1.2 </w:t>
+      </w:r>
+      <w:r>
+        <w:rPr>
+          <w:rStyle w:val="Strong"/>
+        </w:rPr>
+        <w:t>The payment-processor fee</w:t>
+      </w:r>
+      <w:r>
+        <w:rPr/>
+        <w:t xml:space="preserve"> is the fee Paystack takes for each online payment. Its rates are set by Paystack and can change, so this Agreement does not state them as a fixed number. We split that fee three ways: the customer (the booking fee), you, and TrimSlot. At the date of this draft the split is </w:t>
+      </w:r>
+      <w:r>
+        <w:rPr>
+          <w:rStyle w:val="Strong"/>
+        </w:rPr>
+        <w:t>33.333% customer, 33.333% barber, 33.334% TrimSlot</w:t>
+      </w:r>
+      <w:r>
+        <w:rPr/>
+        <w:t>. [OWNER: confirm; the split is an admin setting and the three parts always add up to 100%.] Your share is worked out when the customer pays, from our estimate of the processor fee, and does not change afterwards. If the fee Paystack really charges is different from our estimate, TrimSlot keeps or covers the difference; your share stays as shown.</w:t>
+      </w:r>
+    </w:p>
+    <w:p>
+      <w:pPr>
+        <w:pStyle w:val="BodyText"/>
+        <w:bidi w:val="0"/>
+        <w:jc w:val="left"/>
+        <w:rPr/>
+      </w:pPr>
+      <w:r>
+        <w:rPr/>
+        <w:t>7.1.3 If a booking is refunded, the payment is returned to the customer and no payout is made for it. [LAWYER: refund of the booking fee.]</w:t>
       </w:r>
     </w:p>
     <w:p>
@@ -3784,7 +3950,7 @@
       </w:r>
       <w:r>
         <w:rPr/>
-        <w:t xml:space="preserve"> of the platform fee an online booking of the same price would have paid. [OWNER: confirm the percentage; it is an admin setting.] You will always see the amount owed in the app under "Platform balance owed". You agree to be honest in recording payments; understating or failing to record payments is a breach.</w:t>
+        <w:t xml:space="preserve"> of TrimSlot's charge (7.1.1) an online booking of the same price would have paid. There is no booking fee and no processor fee on these bookings. [OWNER: confirm the percentage; it is an admin setting.] You will always see the amount owed in the app under "Platform balance owed". You agree to be honest in recording payments; understating or failing to record payments is a breach.</w:t>
       </w:r>
     </w:p>
     <w:p>
@@ -10499,17 +10665,57 @@
       </w:pPr>
       <w:r>
         <w:rPr/>
-        <w:t xml:space="preserve">7.4 Paystack's </w:t>
-      </w:r>
-      <w:r>
-        <w:rPr>
-          <w:rStyle w:val="Strong"/>
-        </w:rPr>
-        <w:t>processing fee</w:t>
-      </w:r>
-      <w:r>
-        <w:rPr/>
-        <w:t>, if charged on top, [is / is not] refunded with the payment. [OWNER/LAWYER: decide; the app currently refunds the transaction through Paystack, whose fee rules apply.]</w:t>
+        <w:t xml:space="preserve">7.4 </w:t>
+      </w:r>
+      <w:r>
+        <w:rPr>
+          <w:rStyle w:val="Strong"/>
+        </w:rPr>
+        <w:t>Booking fee.</w:t>
+      </w:r>
+      <w:r>
+        <w:rPr/>
+        <w:t xml:space="preserve"> When you pay online you pay the price plus a small, clearly labelled </w:t>
+      </w:r>
+      <w:r>
+        <w:rPr>
+          <w:rStyle w:val="Strong"/>
+        </w:rPr>
+        <w:t>booking fee</w:t>
+      </w:r>
+      <w:r>
+        <w:rPr/>
+        <w:t xml:space="preserve">, which is part of the payment-processor fee (the current share is 33.333%). When a payment is refunded (in-time cancellation, "not served", duplicate, late or slot-taken payment), you get back </w:t>
+      </w:r>
+      <w:r>
+        <w:rPr>
+          <w:rStyle w:val="Strong"/>
+        </w:rPr>
+        <w:t>everything you were charged, including the booking fee</w:t>
+      </w:r>
+      <w:r>
+        <w:rPr/>
+        <w:t xml:space="preserve">. A </w:t>
+      </w:r>
+      <w:r>
+        <w:rPr>
+          <w:rStyle w:val="Strong"/>
+        </w:rPr>
+        <w:t>credit</w:t>
+      </w:r>
+      <w:r>
+        <w:rPr/>
+        <w:t xml:space="preserve"> (for a missed booking) is for the </w:t>
+      </w:r>
+      <w:r>
+        <w:rPr>
+          <w:rStyle w:val="Strong"/>
+        </w:rPr>
+        <w:t>price only</w:t>
+      </w:r>
+      <w:r>
+        <w:rPr/>
+        <w:t>; the booking fee is not turned into credit. Bookings paid by plan session, credit or on arrival have no booking fee. [LAWYER: confirm this treatment; see question 24b.]</w:t>
       </w:r>
     </w:p>
     <w:p>
@@ -10775,7 +10981,7 @@
       </w:r>
       <w:r>
         <w:rPr/>
-        <w:t xml:space="preserve"> Paystack fee: refunded with the booking? </w:t>
+        <w:t xml:space="preserve"> Booking fee (the customer's share of the processor fee): refunded in full with the booking on a refund, not credited on a credit. Right? (See 24b.) </w:t>
       </w:r>
     </w:p>
     <w:p>
@@ -11467,7 +11673,17 @@
       </w:pPr>
       <w:r>
         <w:rPr/>
-        <w:t>The platform fee for a plan sale is taken from the plan price when you pay and is not charged to you on top (a Paystack processing fee may be shown at checkout). No fee is charged again when you use a session.</w:t>
+        <w:t xml:space="preserve">TrimSlot's charge and the barber's share of the payment processing fee are taken from the barber's side of the plan price. When you buy a plan online you also pay the small </w:t>
+      </w:r>
+      <w:r>
+        <w:rPr>
+          <w:rStyle w:val="Strong"/>
+        </w:rPr>
+        <w:t>booking fee</w:t>
+      </w:r>
+      <w:r>
+        <w:rPr/>
+        <w:t xml:space="preserve"> shown at checkout, once, at purchase. No fee is charged again when you use a session.</w:t>
       </w:r>
     </w:p>
     <w:p>
@@ -20803,7 +21019,7 @@
             </w:pPr>
             <w:r>
               <w:rPr/>
-              <w:t>Gateway amount must equal price plus a plausible processing fee (≤ 8 % or ₦200); otherwise not confirmed, left for staff. Paystack "pass-the-fee" mode is in use in test (customer paid price + fee).</w:t>
+              <w:t>Gateway amount must equal price plus the booking fee (or a plausible processing fee on top: ≤ 8 % or ₦200); otherwise not confirmed, left for staff.</w:t>
             </w:r>
           </w:p>
         </w:tc>
@@ -21236,7 +21452,7 @@
               <w:rPr>
                 <w:rStyle w:val="Strong"/>
               </w:rPr>
-              <w:t>Platform fee</w:t>
+              <w:t>Fee model (pay now)</w:t>
             </w:r>
           </w:p>
         </w:tc>
@@ -21260,10 +21476,64 @@
               <w:rPr/>
             </w:pPr>
             <w:r>
+              <w:rPr/>
+              <w:t xml:space="preserve">The customer pays price + </w:t>
+            </w:r>
+            <w:r>
+              <w:rPr>
+                <w:rStyle w:val="Strong"/>
+              </w:rPr>
+              <w:t>booking fee</w:t>
+            </w:r>
+            <w:r>
+              <w:rPr/>
+              <w:t>. The processor (Paystack) fee is estimated from admin settings (</w:t>
+            </w:r>
+            <w:r>
               <w:rPr>
                 <w:rStyle w:val="SourceText"/>
               </w:rPr>
-              <w:t>platform_fee_naira</w:t>
+              <w:t>ps_percent</w:t>
+            </w:r>
+            <w:r>
+              <w:rPr/>
+              <w:t xml:space="preserve">, </w:t>
+            </w:r>
+            <w:r>
+              <w:rPr>
+                <w:rStyle w:val="SourceText"/>
+              </w:rPr>
+              <w:t>ps_flat</w:t>
+            </w:r>
+            <w:r>
+              <w:rPr/>
+              <w:t xml:space="preserve">, flat waived below a threshold, cap, VAT on top) on the total and split three ways by </w:t>
+            </w:r>
+            <w:r>
+              <w:rPr>
+                <w:rStyle w:val="SourceText"/>
+              </w:rPr>
+              <w:t>fee_share_customer/barber/platform_pct</w:t>
+            </w:r>
+            <w:r>
+              <w:rPr/>
+              <w:t xml:space="preserve"> (sum to 100, validated, audited). Customer's share = booking fee; barber's share and </w:t>
+            </w:r>
+            <w:r>
+              <w:rPr>
+                <w:rStyle w:val="Strong"/>
+              </w:rPr>
+              <w:t>TrimSlot's charge</w:t>
+            </w:r>
+            <w:r>
+              <w:rPr/>
+              <w:t xml:space="preserve"> (</w:t>
+            </w:r>
+            <w:r>
+              <w:rPr>
+                <w:rStyle w:val="SourceText"/>
+              </w:rPr>
+              <w:t>charge_percent</w:t>
             </w:r>
             <w:r>
               <w:rPr/>
@@ -21273,21 +21543,31 @@
               <w:rPr>
                 <w:rStyle w:val="SourceText"/>
               </w:rPr>
-              <w:t>platform_fee_percent</w:t>
-            </w:r>
-            <w:r>
-              <w:rPr/>
-              <w:t xml:space="preserve"> of price, capped at price; if both are 0 the server environment values apply; per-barber override possible (even 0). Production at time of writing: </w:t>
+              <w:t>charge_flat</w:t>
+            </w:r>
+            <w:r>
+              <w:rPr/>
+              <w:t xml:space="preserve">, minimum </w:t>
+            </w:r>
+            <w:r>
+              <w:rPr>
+                <w:rStyle w:val="SourceText"/>
+              </w:rPr>
+              <w:t>charge_min</w:t>
+            </w:r>
+            <w:r>
+              <w:rPr/>
+              <w:t xml:space="preserve">, never above price, per-barber override possible) are taken from the payout. </w:t>
             </w:r>
             <w:r>
               <w:rPr>
                 <w:rStyle w:val="Strong"/>
               </w:rPr>
-              <w:t>₦10 + 0.15 %</w:t>
-            </w:r>
-            <w:r>
-              <w:rPr/>
-              <w:t>. Taken via Paystack split (</w:t>
+              <w:t>Payout = price − barber's share − charge.</w:t>
+            </w:r>
+            <w:r>
+              <w:rPr/>
+              <w:t xml:space="preserve"> Sent to Paystack as subaccount split (</w:t>
             </w:r>
             <w:r>
               <w:rPr>
@@ -21297,7 +21577,17 @@
             </w:r>
             <w:r>
               <w:rPr/>
-              <w:t>). The public settings endpoint reports the effective fee.</w:t>
+              <w:t>, bearer = account) so the real settlement matches. The estimate is frozen on the booking; the real fee from verify is stored (</w:t>
+            </w:r>
+            <w:r>
+              <w:rPr>
+                <w:rStyle w:val="SourceText"/>
+              </w:rPr>
+              <w:t>ps_fee_actual_kobo</w:t>
+            </w:r>
+            <w:r>
+              <w:rPr/>
+              <w:t>) for reporting. Defaults: 33.33 % each, charge 2 % min ₦50. No fixed Paystack number is quoted to users.</w:t>
             </w:r>
           </w:p>
         </w:tc>
@@ -21324,37 +21614,37 @@
               <w:rPr>
                 <w:rStyle w:val="SourceText"/>
               </w:rPr>
+              <w:t>src/fees.ts</w:t>
+            </w:r>
+            <w:r>
+              <w:rPr/>
+              <w:t xml:space="preserve">, </w:t>
+            </w:r>
+            <w:r>
+              <w:rPr>
+                <w:rStyle w:val="SourceText"/>
+              </w:rPr>
               <w:t>src/ledger.ts</w:t>
             </w:r>
             <w:r>
               <w:rPr/>
-              <w:t xml:space="preserve"> (</w:t>
+              <w:t xml:space="preserve">, </w:t>
             </w:r>
             <w:r>
               <w:rPr>
                 <w:rStyle w:val="SourceText"/>
               </w:rPr>
-              <w:t>inAppFeeKobo</w:t>
-            </w:r>
-            <w:r>
-              <w:rPr/>
-              <w:t xml:space="preserve">), </w:t>
+              <w:t>src/paystack.ts</w:t>
+            </w:r>
+            <w:r>
+              <w:rPr/>
+              <w:t xml:space="preserve">, </w:t>
             </w:r>
             <w:r>
               <w:rPr>
                 <w:rStyle w:val="SourceText"/>
               </w:rPr>
-              <w:t>src/paystack.ts</w:t>
-            </w:r>
-            <w:r>
-              <w:rPr/>
-              <w:t xml:space="preserve">, </w:t>
-            </w:r>
-            <w:r>
-              <w:rPr>
-                <w:rStyle w:val="SourceText"/>
-              </w:rPr>
-              <w:t>src/publicSettings.ts</w:t>
+              <w:t>src/bookingService.ts</w:t>
             </w:r>
           </w:p>
         </w:tc>
@@ -21384,6 +21674,170 @@
               <w:rPr>
                 <w:rStyle w:val="Strong"/>
               </w:rPr>
+              <w:t>Fee model (pay on arrival)</w:t>
+            </w:r>
+          </w:p>
+        </w:tc>
+        <w:tc>
+          <w:tcPr>
+            <w:tcW w:w="4191" w:type="dxa"/>
+            <w:tcBorders>
+              <w:left w:val="single" w:sz="2" w:space="0" w:color="808080"/>
+              <w:bottom w:val="single" w:sz="2" w:space="0" w:color="808080"/>
+              <w:right w:val="single" w:sz="6" w:space="0" w:color="808080"/>
+            </w:tcBorders>
+            <w:vAlign w:val="center"/>
+          </w:tcPr>
+          <w:p>
+            <w:pPr>
+              <w:pStyle w:val="TableContents"/>
+              <w:widowControl w:val="false"/>
+              <w:suppressLineNumbers/>
+              <w:bidi w:val="0"/>
+              <w:jc w:val="left"/>
+              <w:rPr/>
+            </w:pPr>
+            <w:r>
+              <w:rPr/>
+              <w:t>No Paystack part and no booking fee; only the TrimSlot charge applies, via the cash commission below.</w:t>
+            </w:r>
+          </w:p>
+        </w:tc>
+        <w:tc>
+          <w:tcPr>
+            <w:tcW w:w="4937" w:type="dxa"/>
+            <w:tcBorders>
+              <w:left w:val="single" w:sz="2" w:space="0" w:color="808080"/>
+              <w:bottom w:val="single" w:sz="2" w:space="0" w:color="808080"/>
+              <w:right w:val="single" w:sz="6" w:space="0" w:color="808080"/>
+            </w:tcBorders>
+            <w:vAlign w:val="center"/>
+          </w:tcPr>
+          <w:p>
+            <w:pPr>
+              <w:pStyle w:val="TableContents"/>
+              <w:widowControl w:val="false"/>
+              <w:suppressLineNumbers/>
+              <w:bidi w:val="0"/>
+              <w:jc w:val="left"/>
+              <w:rPr/>
+            </w:pPr>
+            <w:r>
+              <w:rPr>
+                <w:rStyle w:val="SourceText"/>
+              </w:rPr>
+              <w:t>offAppBreakdown</w:t>
+            </w:r>
+          </w:p>
+        </w:tc>
+      </w:tr>
+      <w:tr>
+        <w:trPr/>
+        <w:tc>
+          <w:tcPr>
+            <w:tcW w:w="1363" w:type="dxa"/>
+            <w:tcBorders>
+              <w:left w:val="single" w:sz="6" w:space="0" w:color="808080"/>
+              <w:bottom w:val="single" w:sz="2" w:space="0" w:color="808080"/>
+              <w:right w:val="single" w:sz="6" w:space="0" w:color="808080"/>
+            </w:tcBorders>
+            <w:vAlign w:val="center"/>
+          </w:tcPr>
+          <w:p>
+            <w:pPr>
+              <w:pStyle w:val="TableContents"/>
+              <w:widowControl w:val="false"/>
+              <w:suppressLineNumbers/>
+              <w:bidi w:val="0"/>
+              <w:jc w:val="left"/>
+              <w:rPr/>
+            </w:pPr>
+            <w:r>
+              <w:rPr>
+                <w:rStyle w:val="Strong"/>
+              </w:rPr>
+              <w:t>Refund of the booking fee</w:t>
+            </w:r>
+          </w:p>
+        </w:tc>
+        <w:tc>
+          <w:tcPr>
+            <w:tcW w:w="4191" w:type="dxa"/>
+            <w:tcBorders>
+              <w:left w:val="single" w:sz="2" w:space="0" w:color="808080"/>
+              <w:bottom w:val="single" w:sz="2" w:space="0" w:color="808080"/>
+              <w:right w:val="single" w:sz="6" w:space="0" w:color="808080"/>
+            </w:tcBorders>
+            <w:vAlign w:val="center"/>
+          </w:tcPr>
+          <w:p>
+            <w:pPr>
+              <w:pStyle w:val="TableContents"/>
+              <w:widowControl w:val="false"/>
+              <w:suppressLineNumbers/>
+              <w:bidi w:val="0"/>
+              <w:jc w:val="left"/>
+              <w:rPr/>
+            </w:pPr>
+            <w:r>
+              <w:rPr/>
+              <w:t>A refund returns price + booking fee; a credit is for the price only. Open lawyer question 24b.</w:t>
+            </w:r>
+          </w:p>
+        </w:tc>
+        <w:tc>
+          <w:tcPr>
+            <w:tcW w:w="4937" w:type="dxa"/>
+            <w:tcBorders>
+              <w:left w:val="single" w:sz="2" w:space="0" w:color="808080"/>
+              <w:bottom w:val="single" w:sz="2" w:space="0" w:color="808080"/>
+              <w:right w:val="single" w:sz="6" w:space="0" w:color="808080"/>
+            </w:tcBorders>
+            <w:vAlign w:val="center"/>
+          </w:tcPr>
+          <w:p>
+            <w:pPr>
+              <w:pStyle w:val="TableContents"/>
+              <w:widowControl w:val="false"/>
+              <w:suppressLineNumbers/>
+              <w:bidi w:val="0"/>
+              <w:jc w:val="left"/>
+              <w:rPr/>
+            </w:pPr>
+            <w:r>
+              <w:rPr>
+                <w:rStyle w:val="SourceText"/>
+              </w:rPr>
+              <w:t>src/refundFlow.ts</w:t>
+            </w:r>
+          </w:p>
+        </w:tc>
+      </w:tr>
+      <w:tr>
+        <w:trPr/>
+        <w:tc>
+          <w:tcPr>
+            <w:tcW w:w="1363" w:type="dxa"/>
+            <w:tcBorders>
+              <w:left w:val="single" w:sz="6" w:space="0" w:color="808080"/>
+              <w:bottom w:val="single" w:sz="2" w:space="0" w:color="808080"/>
+              <w:right w:val="single" w:sz="6" w:space="0" w:color="808080"/>
+            </w:tcBorders>
+            <w:vAlign w:val="center"/>
+          </w:tcPr>
+          <w:p>
+            <w:pPr>
+              <w:pStyle w:val="TableContents"/>
+              <w:widowControl w:val="false"/>
+              <w:suppressLineNumbers/>
+              <w:bidi w:val="0"/>
+              <w:jc w:val="left"/>
+              <w:rPr/>
+            </w:pPr>
+            <w:r>
+              <w:rPr>
+                <w:rStyle w:val="Strong"/>
+              </w:rPr>
               <w:t>Cash commission</w:t>
             </w:r>
           </w:p>
@@ -21449,7 +21903,7 @@
             </w:r>
             <w:r>
               <w:rPr/>
-              <w:t xml:space="preserve">) × the in-app fee for that price; one ledger row per booking; setting </w:t>
+              <w:t xml:space="preserve">) × TrimSlot's charge for that price; one ledger row per booking; setting </w:t>
             </w:r>
             <w:r>
               <w:rPr>

</xml_diff>

<commit_message>
Private barber share links: /b/<code> with QR, My barbers, server-side access checks, tests
</commit_message>
<xml_diff>
--- a/legal/legal-pack.docx
+++ b/legal/legal-pack.docx
@@ -3229,7 +3229,7 @@
       </w:r>
       <w:r>
         <w:rPr/>
-        <w:t xml:space="preserve"> Is the Paystack fee pass-through lawful and adequately disclosed? </w:t>
+        <w:t xml:space="preserve"> Is the "booking fee" (the customer's share of the payment-processor fee) lawful and adequately disclosed at checkout? Is it refunded with the booking? (See 24a and 24b.) </w:t>
       </w:r>
     </w:p>
     <w:p>
@@ -5790,6 +5790,90 @@
             <w:r>
               <w:rPr/>
               <w:t>You, Paystack</w:t>
+            </w:r>
+          </w:p>
+        </w:tc>
+      </w:tr>
+      <w:tr>
+        <w:trPr/>
+        <w:tc>
+          <w:tcPr>
+            <w:tcW w:w="1659" w:type="dxa"/>
+            <w:tcBorders>
+              <w:left w:val="single" w:sz="6" w:space="0" w:color="808080"/>
+              <w:bottom w:val="single" w:sz="2" w:space="0" w:color="808080"/>
+              <w:right w:val="single" w:sz="6" w:space="0" w:color="808080"/>
+            </w:tcBorders>
+            <w:vAlign w:val="center"/>
+          </w:tcPr>
+          <w:p>
+            <w:pPr>
+              <w:pStyle w:val="TableContents"/>
+              <w:widowControl w:val="false"/>
+              <w:suppressLineNumbers/>
+              <w:bidi w:val="0"/>
+              <w:jc w:val="left"/>
+              <w:rPr/>
+            </w:pPr>
+            <w:r>
+              <w:rPr>
+                <w:rStyle w:val="Strong"/>
+              </w:rPr>
+              <w:t>My barbers</w:t>
+            </w:r>
+            <w:r>
+              <w:rPr/>
+              <w:t xml:space="preserve"> (customers)</w:t>
+            </w:r>
+          </w:p>
+        </w:tc>
+        <w:tc>
+          <w:tcPr>
+            <w:tcW w:w="7164" w:type="dxa"/>
+            <w:tcBorders>
+              <w:left w:val="single" w:sz="2" w:space="0" w:color="808080"/>
+              <w:bottom w:val="single" w:sz="2" w:space="0" w:color="808080"/>
+              <w:right w:val="single" w:sz="6" w:space="0" w:color="808080"/>
+            </w:tcBorders>
+            <w:vAlign w:val="center"/>
+          </w:tcPr>
+          <w:p>
+            <w:pPr>
+              <w:pStyle w:val="TableContents"/>
+              <w:widowControl w:val="false"/>
+              <w:suppressLineNumbers/>
+              <w:bidi w:val="0"/>
+              <w:jc w:val="left"/>
+              <w:rPr/>
+            </w:pPr>
+            <w:r>
+              <w:rPr/>
+              <w:t>The list of barbers you added, opened through their private link, or booked, and when. A barber's private link and QR code let anyone who has them see the shop's public profile (shop name, photo, services, prices, hours, ratings, plans); barbers are not listed to the public otherwise. Barbers can make a new link at any time.</w:t>
+            </w:r>
+          </w:p>
+        </w:tc>
+        <w:tc>
+          <w:tcPr>
+            <w:tcW w:w="1382" w:type="dxa"/>
+            <w:tcBorders>
+              <w:left w:val="single" w:sz="2" w:space="0" w:color="808080"/>
+              <w:bottom w:val="single" w:sz="2" w:space="0" w:color="808080"/>
+              <w:right w:val="single" w:sz="6" w:space="0" w:color="808080"/>
+            </w:tcBorders>
+            <w:vAlign w:val="center"/>
+          </w:tcPr>
+          <w:p>
+            <w:pPr>
+              <w:pStyle w:val="TableContents"/>
+              <w:widowControl w:val="false"/>
+              <w:suppressLineNumbers/>
+              <w:bidi w:val="0"/>
+              <w:jc w:val="left"/>
+              <w:rPr/>
+            </w:pPr>
+            <w:r>
+              <w:rPr/>
+              <w:t>You, the barber's link</w:t>
             </w:r>
           </w:p>
         </w:tc>

</xml_diff>

<commit_message>
Legal pages and app: no business numbers on public pages (fees, split, commission, auto-approve time); public-settings serves policy numbers only; lawyer files marked internal; build refuses internal tokens; payment behaviour wording; 48h re-check; avatar row height; docs
</commit_message>
<xml_diff>
--- a/legal/legal-pack.docx
+++ b/legal/legal-pack.docx
@@ -27,6 +27,24 @@
         <w:rPr>
           <w:b/>
         </w:rPr>
+        <w:t>INTERNAL – FOR THE OWNER AND THE LAWYER ONLY. DO NOT PUBLISH.</w:t>
+      </w:r>
+      <w:r>
+        <w:rPr/>
+        <w:t xml:space="preserve"> This pack contains business details (fees, charges, internal settings) that must not appear on any public page.</w:t>
+      </w:r>
+    </w:p>
+    <w:p>
+      <w:pPr>
+        <w:pStyle w:val="BodyText"/>
+        <w:bidi w:val="0"/>
+        <w:jc w:val="left"/>
+        <w:rPr/>
+      </w:pPr>
+      <w:r>
+        <w:rPr>
+          <w:b/>
+        </w:rPr>
         <w:t>DRAFT – not legal advice – lawyer review required.</w:t>
       </w:r>
       <w:r>
@@ -45,6 +63,24 @@
       <w:r>
         <w:rPr/>
         <w:t>Open questions for the lawyer</w:t>
+      </w:r>
+    </w:p>
+    <w:p>
+      <w:pPr>
+        <w:pStyle w:val="BlockQuotation"/>
+        <w:bidi w:val="0"/>
+        <w:jc w:val="left"/>
+        <w:rPr/>
+      </w:pPr>
+      <w:r>
+        <w:rPr>
+          <w:rStyle w:val="Strong"/>
+        </w:rPr>
+        <w:t>INTERNAL – for the owner and the lawyer only. Do NOT publish this file or the legal pack</w:t>
+      </w:r>
+      <w:r>
+        <w:rPr/>
+        <w:t xml:space="preserve"> (no web page, no public repository, no app screen). It contains business details such as fees, charges, the split of processing costs and internal settings. Only files 01–06 are turned into public pages, and they must not quote those numbers.</w:t>
       </w:r>
     </w:p>
     <w:p>
@@ -2432,7 +2468,7 @@
       </w:r>
       <w:r>
         <w:rPr/>
-        <w:t>. It is shown as its own line, and the total is shown, before you pay. The booking fee is your share (33.333%) of the payment company's processing fee; the barber and TrimSlot share the rest. We do not quote the payment company's own rates, because they can change. [LAWYER/OWNER: confirm this disclosure — see open questions.]</w:t>
+        <w:t>. It is shown as its own line, and the total is shown, before you pay. Pay-on-arrival bookings, plan sessions and credits have no booking fee.</w:t>
       </w:r>
     </w:p>
     <w:p>
@@ -2474,7 +2510,7 @@
       </w:r>
       <w:r>
         <w:rPr/>
-        <w:t>. A booking is confirmed only when Paystack confirms your payment to us. If someone else's payment for the same time is confirmed first, your booking is not confirmed and your payment is refunded automatically. If you do not pay within 15 minutes, the booking is marked "Incomplete" and you are not charged. If your payment is confirmed after that and the time is still free, the booking is confirmed; if the time has been taken, the payment is refunded automatically.</w:t>
+        <w:t>. A booking is confirmed only when Paystack confirms your payment to us. If someone else's payment for the same time is confirmed first, your booking is not confirmed and your payment is refunded automatically. If you do not pay within 15 minutes, we first ask Paystack whether you paid. If you did, the booking is confirmed (or the payment is refunded if the time was taken). If you did not, the booking is marked "Incomplete" and you are not charged. If we cannot check with Paystack, we tell you so, and if money left your account we confirm the booking or refund you ourselves. Payments must be in Nigerian naira (NGN). If your payment is confirmed after that and the time is still free, the booking is confirmed; if the time has been taken, the payment is refunded automatically.</w:t>
       </w:r>
     </w:p>
     <w:p>
@@ -2702,7 +2738,7 @@
       </w:r>
       <w:r>
         <w:rPr/>
-        <w:t xml:space="preserve"> (approved by us, or automatically after 3 hour(s) if nobody has decided). You do not also get a credit. </w:t>
+        <w:t xml:space="preserve"> (approved by us, or approved automatically if nobody has decided within a short time). You do not also get a credit. </w:t>
       </w:r>
     </w:p>
     <w:p>
@@ -3007,7 +3043,7 @@
       </w:pPr>
       <w:r>
         <w:rPr/>
-        <w:t>8.2 Barbers pay TrimSlot fees under the Barber Agreement. Fees are deducted automatically from online payments through the Paystack split; you do not pay them on top of the price (apart from 8.1).</w:t>
+        <w:t>8.2 Barbers pay TrimSlot a service charge and the payment processing fees as set out in the Barber Agreement. You do not pay these on top of the price (apart from the booking fee in 8.1).</w:t>
       </w:r>
     </w:p>
     <w:p>
@@ -3843,7 +3879,7 @@
       </w:pPr>
       <w:r>
         <w:rPr/>
-        <w:t xml:space="preserve">When a customer pays you at the shop, you record it in the app. TrimSlot adds a commission to a balance you owe. You can see the balance in the app. </w:t>
+        <w:t xml:space="preserve">When a customer pays you at the shop, you record it in the app. TrimSlot adds its service charge for that booking to a balance you owe. You can see the balance in the app. </w:t>
       </w:r>
     </w:p>
     <w:p>
@@ -4388,13 +4424,121 @@
       </w:r>
       <w:r>
         <w:rPr/>
-        <w:t xml:space="preserve">. Paystack sends the rest to your bank account after two things are taken from your price: </w:t>
-      </w:r>
-      <w:r>
-        <w:rPr>
-          <w:rStyle w:val="Strong"/>
-        </w:rPr>
-        <w:t>your share of the payment-processor fee</w:t>
+        <w:t xml:space="preserve">. Paystack sends the rest to your bank account after two things are taken from your price: a </w:t>
+      </w:r>
+      <w:r>
+        <w:rPr>
+          <w:rStyle w:val="Strong"/>
+        </w:rPr>
+        <w:t>Paystack fee</w:t>
+      </w:r>
+      <w:r>
+        <w:rPr/>
+        <w:t xml:space="preserve"> (your part of the payment-processing cost) and </w:t>
+      </w:r>
+      <w:r>
+        <w:rPr>
+          <w:rStyle w:val="Strong"/>
+        </w:rPr>
+        <w:t>TrimSlot's service charge</w:t>
+      </w:r>
+      <w:r>
+        <w:rPr/>
+        <w:t xml:space="preserve">. So: </w:t>
+      </w:r>
+      <w:r>
+        <w:rPr>
+          <w:rStyle w:val="Emphasis"/>
+        </w:rPr>
+        <w:t>your payout = your price − the Paystack fee − TrimSlot's service charge</w:t>
+      </w:r>
+      <w:r>
+        <w:rPr/>
+        <w:t>. The exact amounts for every booking are shown in the app, in your bookings and in your earnings screen. They are worked out when the customer pays and do not change afterwards.</w:t>
+      </w:r>
+    </w:p>
+    <w:p>
+      <w:pPr>
+        <w:pStyle w:val="BodyText"/>
+        <w:bidi w:val="0"/>
+        <w:jc w:val="left"/>
+        <w:rPr/>
+      </w:pPr>
+      <w:r>
+        <w:rPr/>
+        <w:t xml:space="preserve">7.1.1 </w:t>
+      </w:r>
+      <w:r>
+        <w:rPr>
+          <w:rStyle w:val="Strong"/>
+        </w:rPr>
+        <w:t>TrimSlot's service charge</w:t>
+      </w:r>
+      <w:r>
+        <w:rPr/>
+        <w:t xml:space="preserve"> is set by TrimSlot and shown in the app and in your earnings screen. We may agree a different charge with you in writing or in the app. The charge is never more than the price.</w:t>
+      </w:r>
+    </w:p>
+    <w:p>
+      <w:pPr>
+        <w:pStyle w:val="BodyText"/>
+        <w:bidi w:val="0"/>
+        <w:jc w:val="left"/>
+        <w:rPr/>
+      </w:pPr>
+      <w:r>
+        <w:rPr/>
+        <w:t xml:space="preserve">7.1.2 </w:t>
+      </w:r>
+      <w:r>
+        <w:rPr>
+          <w:rStyle w:val="Strong"/>
+        </w:rPr>
+        <w:t>The Paystack fee</w:t>
+      </w:r>
+      <w:r>
+        <w:rPr/>
+        <w:t xml:space="preserve"> is a processing cost that comes from Paystack. Its rates are set by Paystack and can change, so this Agreement does not state them as a fixed number. Your part is shown to you as "Paystack fee" on each booking. If the fee Paystack really charges is different from our estimate, TrimSlot keeps or covers the difference; the amount shown to you stays as shown.</w:t>
+      </w:r>
+    </w:p>
+    <w:p>
+      <w:pPr>
+        <w:pStyle w:val="BodyText"/>
+        <w:bidi w:val="0"/>
+        <w:jc w:val="left"/>
+        <w:rPr/>
+      </w:pPr>
+      <w:r>
+        <w:rPr/>
+        <w:t>7.1.3 If a booking is refunded, the payment is returned to the customer and no payout is made for it.</w:t>
+      </w:r>
+    </w:p>
+    <w:p>
+      <w:pPr>
+        <w:pStyle w:val="BodyText"/>
+        <w:bidi w:val="0"/>
+        <w:jc w:val="left"/>
+        <w:rPr/>
+      </w:pPr>
+      <w:r>
+        <w:rPr/>
+        <w:t xml:space="preserve">7.2 </w:t>
+      </w:r>
+      <w:r>
+        <w:rPr>
+          <w:rStyle w:val="Strong"/>
+        </w:rPr>
+        <w:t>Pay-on-arrival bookings (cash or transfer).</w:t>
+      </w:r>
+      <w:r>
+        <w:rPr/>
+        <w:t xml:space="preserve"> These payments go straight from the customer to you and do not pass through TrimSlot. When you mark such a booking </w:t>
+      </w:r>
+      <w:r>
+        <w:rPr>
+          <w:rStyle w:val="Strong"/>
+        </w:rPr>
+        <w:t>completed</w:t>
       </w:r>
       <w:r>
         <w:rPr/>
@@ -4404,144 +4548,6 @@
         <w:rPr>
           <w:rStyle w:val="Strong"/>
         </w:rPr>
-        <w:t>TrimSlot's charge</w:t>
-      </w:r>
-      <w:r>
-        <w:rPr/>
-        <w:t xml:space="preserve">. So: </w:t>
-      </w:r>
-      <w:r>
-        <w:rPr>
-          <w:rStyle w:val="Emphasis"/>
-        </w:rPr>
-        <w:t>your payout = your price − your share of the processor fee − TrimSlot's charge</w:t>
-      </w:r>
-      <w:r>
-        <w:rPr/>
-        <w:t>. You can see this for every booking in the app, in your bookings and earnings.</w:t>
-      </w:r>
-    </w:p>
-    <w:p>
-      <w:pPr>
-        <w:pStyle w:val="BodyText"/>
-        <w:bidi w:val="0"/>
-        <w:jc w:val="left"/>
-        <w:rPr/>
-      </w:pPr>
-      <w:r>
-        <w:rPr/>
-        <w:t xml:space="preserve">7.1.1 </w:t>
-      </w:r>
-      <w:r>
-        <w:rPr>
-          <w:rStyle w:val="Strong"/>
-        </w:rPr>
-        <w:t>TrimSlot's charge</w:t>
-      </w:r>
-      <w:r>
-        <w:rPr/>
-        <w:t xml:space="preserve"> is, at the date of this draft, </w:t>
-      </w:r>
-      <w:r>
-        <w:rPr>
-          <w:rStyle w:val="Strong"/>
-        </w:rPr>
-        <w:t>2% of the price</w:t>
-      </w:r>
-      <w:r>
-        <w:rPr/>
-        <w:t xml:space="preserve"> (plus ₦0), with a </w:t>
-      </w:r>
-      <w:r>
-        <w:rPr>
-          <w:rStyle w:val="Strong"/>
-        </w:rPr>
-        <w:t>minimum of ₦50</w:t>
-      </w:r>
-      <w:r>
-        <w:rPr/>
-        <w:t>, and never more than the price. [OWNER: confirm; these are admin-configurable settings, and we can set a different charge for you in writing or in the app.]</w:t>
-      </w:r>
-    </w:p>
-    <w:p>
-      <w:pPr>
-        <w:pStyle w:val="BodyText"/>
-        <w:bidi w:val="0"/>
-        <w:jc w:val="left"/>
-        <w:rPr/>
-      </w:pPr>
-      <w:r>
-        <w:rPr/>
-        <w:t xml:space="preserve">7.1.2 </w:t>
-      </w:r>
-      <w:r>
-        <w:rPr>
-          <w:rStyle w:val="Strong"/>
-        </w:rPr>
-        <w:t>The payment-processor fee</w:t>
-      </w:r>
-      <w:r>
-        <w:rPr/>
-        <w:t xml:space="preserve"> is the fee Paystack takes for each online payment. Its rates are set by Paystack and can change, so this Agreement does not state them as a fixed number. We split that fee three ways: the customer (the booking fee), you, and TrimSlot. At the date of this draft the split is </w:t>
-      </w:r>
-      <w:r>
-        <w:rPr>
-          <w:rStyle w:val="Strong"/>
-        </w:rPr>
-        <w:t>33.333% customer, 33.333% barber, 33.334% TrimSlot</w:t>
-      </w:r>
-      <w:r>
-        <w:rPr/>
-        <w:t>. [OWNER: confirm; the split is an admin setting and the three parts always add up to 100%.] Your share is worked out when the customer pays, from our estimate of the processor fee, and does not change afterwards. If the fee Paystack really charges is different from our estimate, TrimSlot keeps or covers the difference; your share stays as shown.</w:t>
-      </w:r>
-    </w:p>
-    <w:p>
-      <w:pPr>
-        <w:pStyle w:val="BodyText"/>
-        <w:bidi w:val="0"/>
-        <w:jc w:val="left"/>
-        <w:rPr/>
-      </w:pPr>
-      <w:r>
-        <w:rPr/>
-        <w:t>7.1.3 If a booking is refunded, the payment is returned to the customer and no payout is made for it. [LAWYER: refund of the booking fee.]</w:t>
-      </w:r>
-    </w:p>
-    <w:p>
-      <w:pPr>
-        <w:pStyle w:val="BodyText"/>
-        <w:bidi w:val="0"/>
-        <w:jc w:val="left"/>
-        <w:rPr/>
-      </w:pPr>
-      <w:r>
-        <w:rPr/>
-        <w:t xml:space="preserve">7.2 </w:t>
-      </w:r>
-      <w:r>
-        <w:rPr>
-          <w:rStyle w:val="Strong"/>
-        </w:rPr>
-        <w:t>Pay-on-arrival bookings (cash or transfer).</w:t>
-      </w:r>
-      <w:r>
-        <w:rPr/>
-        <w:t xml:space="preserve"> These payments go straight from the customer to you and do not pass through TrimSlot. When you mark such a booking </w:t>
-      </w:r>
-      <w:r>
-        <w:rPr>
-          <w:rStyle w:val="Strong"/>
-        </w:rPr>
-        <w:t>completed</w:t>
-      </w:r>
-      <w:r>
-        <w:rPr/>
-        <w:t xml:space="preserve"> and </w:t>
-      </w:r>
-      <w:r>
-        <w:rPr>
-          <w:rStyle w:val="Strong"/>
-        </w:rPr>
         <w:t>paid</w:t>
       </w:r>
       <w:r>
@@ -4552,33 +4558,23 @@
         <w:rPr>
           <w:rStyle w:val="Strong"/>
         </w:rPr>
-        <w:t>commission</w:t>
-      </w:r>
-      <w:r>
-        <w:rPr/>
-        <w:t xml:space="preserve"> accrues on your TrimSlot balance equal to </w:t>
-      </w:r>
-      <w:r>
-        <w:rPr>
-          <w:rStyle w:val="Strong"/>
-        </w:rPr>
-        <w:t>50%</w:t>
-      </w:r>
-      <w:r>
-        <w:rPr/>
-        <w:t xml:space="preserve"> of TrimSlot's charge (7.1.1) an online booking of the same price would have paid. There is no booking fee and no processor fee on these bookings. [OWNER: confirm the percentage; it is an admin setting.] You will always see the amount owed in the app under "Platform balance owed". You agree to be honest in recording payments; understating or failing to record payments is a breach.</w:t>
-      </w:r>
-    </w:p>
-    <w:p>
-      <w:pPr>
-        <w:pStyle w:val="BodyText"/>
-        <w:bidi w:val="0"/>
-        <w:jc w:val="left"/>
-        <w:rPr/>
-      </w:pPr>
-      <w:r>
-        <w:rPr/>
-        <w:t>7.3 We may change fees or the commission by giving at least [30] days' notice in the app. Changes do not apply to bookings already confirmed.</w:t>
+        <w:t>service charge</w:t>
+      </w:r>
+      <w:r>
+        <w:rPr/>
+        <w:t xml:space="preserve"> accrues on your TrimSlot balance. The amount is shown on the booking and in your earnings screen. There is no booking fee and no Paystack fee on these bookings. You will always see the amount owed in the app under "Platform balance owed". You agree to be honest in recording payments; understating or failing to record payments is a breach.</w:t>
+      </w:r>
+    </w:p>
+    <w:p>
+      <w:pPr>
+        <w:pStyle w:val="BodyText"/>
+        <w:bidi w:val="0"/>
+        <w:jc w:val="left"/>
+        <w:rPr/>
+      </w:pPr>
+      <w:r>
+        <w:rPr/>
+        <w:t>7.3 We may change fees or charges by giving at least [30] days' notice in the app. Changes do not apply to bookings already confirmed.</w:t>
       </w:r>
     </w:p>
     <w:p>
@@ -4602,19 +4598,19 @@
       </w:pPr>
       <w:r>
         <w:rPr/>
-        <w:t>8. Cash-commission balance and netting</w:t>
-      </w:r>
-    </w:p>
-    <w:p>
-      <w:pPr>
-        <w:pStyle w:val="BodyText"/>
-        <w:bidi w:val="0"/>
-        <w:jc w:val="left"/>
-        <w:rPr/>
-      </w:pPr>
-      <w:r>
-        <w:rPr/>
-        <w:t xml:space="preserve">8.1 Commission on cash bookings is a </w:t>
+        <w:t>8. Balance owed and how it is paid</w:t>
+      </w:r>
+    </w:p>
+    <w:p>
+      <w:pPr>
+        <w:pStyle w:val="BodyText"/>
+        <w:bidi w:val="0"/>
+        <w:jc w:val="left"/>
+        <w:rPr/>
+      </w:pPr>
+      <w:r>
+        <w:rPr/>
+        <w:t xml:space="preserve">8.1 The service charge on cash bookings is a </w:t>
       </w:r>
       <w:r>
         <w:rPr>
@@ -4652,43 +4648,11 @@
         <w:rPr>
           <w:rStyle w:val="Strong"/>
         </w:rPr>
-        <w:t>Automatic netting.</w:t>
-      </w:r>
-      <w:r>
-        <w:rPr/>
-        <w:t xml:space="preserve"> When a customer pays you online, we may raise the amount TrimSlot keeps from that payment, by up to the balance you owe, so that the balance is paid off from your online income. Rules: * We never take more than you owe; * you always keep </w:t>
-      </w:r>
-      <w:r>
-        <w:rPr>
-          <w:rStyle w:val="Strong"/>
-        </w:rPr>
-        <w:t>at least [50]% of the payment</w:t>
-      </w:r>
-      <w:r>
-        <w:rPr/>
-        <w:t xml:space="preserve"> (a setting; the "minimum payout share"), so one payment cannot be wiped out by old debt; * older debt is paid first; * if the customer is refunded, the netting is reversed and the balance goes back up.</w:t>
-      </w:r>
-    </w:p>
-    <w:p>
-      <w:pPr>
-        <w:pStyle w:val="BodyText"/>
-        <w:bidi w:val="0"/>
-        <w:jc w:val="left"/>
-        <w:rPr/>
-      </w:pPr>
-      <w:r>
-        <w:rPr/>
-        <w:t xml:space="preserve">The netted amount is worked out </w:t>
-      </w:r>
-      <w:r>
-        <w:rPr>
-          <w:rStyle w:val="Strong"/>
-        </w:rPr>
-        <w:t>when the customer starts to pay</w:t>
-      </w:r>
-      <w:r>
-        <w:rPr/>
-        <w:t xml:space="preserve"> and is applied to your balance only when the payment is confirmed. If your balance is settled in the meantime (for example by a manual settlement) while a customer is still in checkout, that payment can take more from your share than you owed. The app records this; it is not paid back to you automatically. TrimSlot staff review it with you and may correct it. [OWNER/LAWYER: confirm this is acceptable or add an automatic correction; see question 56.]</w:t>
+        <w:t>Taking it from online payments.</w:t>
+      </w:r>
+      <w:r>
+        <w:rPr/>
+        <w:t xml:space="preserve"> When a customer pays you online, we may take part of what you owe from that payment, so that the balance is paid off from your online income. We never take more than you owe, the oldest debt is paid first, you always keep a fair part of every payment, and if the customer is refunded the amount is put back on your balance. The amounts are shown in the app. If your balance is settled in another way while a customer is still in checkout, that payment can take more than you owed. The app records this and TrimSlot staff will review it with you and correct it.</w:t>
       </w:r>
     </w:p>
     <w:p>
@@ -4732,27 +4696,7 @@
       </w:r>
       <w:r>
         <w:rPr/>
-        <w:t xml:space="preserve"> We may set a </w:t>
-      </w:r>
-      <w:r>
-        <w:rPr>
-          <w:rStyle w:val="Strong"/>
-        </w:rPr>
-        <w:t>maximum balance</w:t>
-      </w:r>
-      <w:r>
-        <w:rPr/>
-        <w:t xml:space="preserve"> and/or a </w:t>
-      </w:r>
-      <w:r>
-        <w:rPr>
-          <w:rStyle w:val="Strong"/>
-        </w:rPr>
-        <w:t>maximum age</w:t>
-      </w:r>
-      <w:r>
-        <w:rPr/>
-        <w:t xml:space="preserve"> for the balance. If you go over a limit, the app </w:t>
+        <w:t xml:space="preserve"> We may set limits on how large and how old your balance can be. If you go over a limit, the app </w:t>
       </w:r>
       <w:r>
         <w:rPr>
@@ -4782,7 +4726,7 @@
       </w:r>
       <w:r>
         <w:rPr/>
-        <w:t>: any suspension is a decision by TrimSlot staff (section 12). [OWNER: confirm the limits; at the date of this draft they are not set.]</w:t>
+        <w:t xml:space="preserve">: any suspension is a decision by TrimSlot staff (section 12). </w:t>
       </w:r>
     </w:p>
     <w:p>
@@ -5064,7 +5008,7 @@
       </w:r>
       <w:r>
         <w:rPr/>
-        <w:t xml:space="preserve"> (not given a credit) as the Policy says: the refund is pending approval and is approved automatically after 3 hour(s) if nobody decides. The app does not take the refunded amount from your balance or your payouts. [OWNER/LAWYER: check how Paystack reverses the split on a refund and who bears it; see question 55.] A plan session or credit that the customer used is returned to them.</w:t>
+        <w:t xml:space="preserve"> (not given a credit) as the Policy says: the refund is pending approval and is approved automatically if nobody decides within a short time. The app does not take the refunded amount from your balance or your payouts. A plan session or credit that the customer used is returned to them.</w:t>
       </w:r>
     </w:p>
     <w:p>
@@ -6775,7 +6719,7 @@
             </w:pPr>
             <w:r>
               <w:rPr/>
-              <w:t>Plans bought, sessions used, expiry, session credits (including free loyalty credits, if that reward is switched on, earned after a number of completed visits with the same barber, and credits that staff have removed); for barbers, the commission balance owed and its history</w:t>
+              <w:t>Plans bought, sessions used, expiry, session credits (including free loyalty credits, if that reward is switched on, earned after a number of completed visits with the same barber, and credits that staff have removed); for barbers, the balance owed and its history</w:t>
             </w:r>
           </w:p>
         </w:tc>
@@ -7135,17 +7079,7 @@
             </w:pPr>
             <w:r>
               <w:rPr/>
-              <w:t xml:space="preserve">IP address, browser type, request logs (time, page, response code, account ID), security counters, error logs. The security counters (the </w:t>
-            </w:r>
-            <w:r>
-              <w:rPr>
-                <w:rStyle w:val="SourceText"/>
-              </w:rPr>
-              <w:t>rate_limits</w:t>
-            </w:r>
-            <w:r>
-              <w:rPr/>
-              <w:t xml:space="preserve"> records) store, for a short time, your </w:t>
+              <w:t xml:space="preserve">IP address, browser type, request logs (time, page, response code, account ID), security counters, error logs. The security counters store, for a short time, your </w:t>
             </w:r>
             <w:r>
               <w:rPr>
@@ -7245,7 +7179,7 @@
             </w:pPr>
             <w:r>
               <w:rPr/>
-              <w:t>An audit trail of actions by staff and the system on accounts, bookings and payments (who, what, when, why); alerts to staff about refunds waiting, auto-approved refunds, refund failures and deletion requests</w:t>
+              <w:t>An audit trail of actions by staff and the system on accounts, bookings and payments (who, what, when, why); alerts to staff about payments, refunds and requests that need attention</w:t>
             </w:r>
           </w:p>
         </w:tc>
@@ -7460,7 +7394,7 @@
             </w:pPr>
             <w:r>
               <w:rPr/>
-              <w:t>Take payments, issue refunds and credits, run plans, pay barbers, keep commission balances, detect failed or duplicate payments</w:t>
+              <w:t>Take payments, issue refunds and credits, run plans, pay barbers, keep balances, detect failed or duplicate payments</w:t>
             </w:r>
           </w:p>
         </w:tc>
@@ -10404,7 +10338,7 @@
       </w:pPr>
       <w:r>
         <w:rPr/>
-        <w:t xml:space="preserve">If you cancel in time and you paid online, you get a refund. TrimSlot staff approve it. If no one decides in 3 hour(s), it is approved by itself. </w:t>
+        <w:t xml:space="preserve">If you cancel in time and you paid online, you get a refund. TrimSlot staff approve it. If no one decides within a short time, it is approved by itself. </w:t>
       </w:r>
     </w:p>
     <w:p>
@@ -11340,7 +11274,7 @@
         <w:rPr>
           <w:rStyle w:val="Strong"/>
         </w:rPr>
-        <w:t>not approved or rejected it within 3 hour(s)</w:t>
+        <w:t>not approved or rejected it within a short time</w:t>
       </w:r>
       <w:r>
         <w:rPr/>
@@ -11354,7 +11288,7 @@
       </w:r>
       <w:r>
         <w:rPr/>
-        <w:t xml:space="preserve"> and the refund request is sent to Paystack. The automatic approval is done by a scheduled check, so it happens at the next check after that time: within minutes if TrimSlot runs the check every minute, otherwise at the daily run. [OWNER: confirm which schedule is in use.] You are notified when it is approved. You can see the status ("refund pending", "refunded") on your booking.</w:t>
+        <w:t xml:space="preserve"> and the refund request is sent to Paystack. You are notified when it is approved. You can see the status ("refund pending", "refunded") on your booking.</w:t>
       </w:r>
     </w:p>
     <w:p>
@@ -11772,7 +11706,17 @@
       </w:r>
       <w:r>
         <w:rPr/>
-        <w:t xml:space="preserve">. If you do not complete payment, or you leave and cancel, the attempt is marked </w:t>
+        <w:t xml:space="preserve">. When you start to pay, the attempt is kept open a little longer so a slow payment page does not end it (it cannot be stretched for long). Before an attempt is closed, </w:t>
+      </w:r>
+      <w:r>
+        <w:rPr>
+          <w:rStyle w:val="Strong"/>
+        </w:rPr>
+        <w:t>we ask Paystack whether it was paid</w:t>
+      </w:r>
+      <w:r>
+        <w:rPr/>
+        <w:t xml:space="preserve">. If it was paid and the time is still free, the booking is confirmed (6.2); if the time was taken, the payment is refunded (section 7). If it was not paid, the attempt is marked </w:t>
       </w:r>
       <w:r>
         <w:rPr>
@@ -11788,11 +11732,21 @@
         <w:rPr>
           <w:rStyle w:val="Strong"/>
         </w:rPr>
-        <w:t>you are not charged</w:t>
-      </w:r>
-      <w:r>
-        <w:rPr/>
-        <w:t>, and the barber does not see it.</w:t>
+        <w:t>we tell you that you were not charged</w:t>
+      </w:r>
+      <w:r>
+        <w:rPr/>
+        <w:t xml:space="preserve">, and the barber does not see it. If Paystack cannot be reached, we keep the attempt open for up to one more hour; if we still cannot check, we close it and say so honestly: </w:t>
+      </w:r>
+      <w:r>
+        <w:rPr>
+          <w:rStyle w:val="Strong"/>
+        </w:rPr>
+        <w:t>if money left your account, we confirm the booking or refund you ourselves</w:t>
+      </w:r>
+      <w:r>
+        <w:rPr/>
+        <w:t>, and we do not tell you that you were not charged. We also re-check recent unpaid attempts from time to time.</w:t>
       </w:r>
     </w:p>
     <w:p>
@@ -11870,17 +11824,17 @@
       </w:pPr>
       <w:r>
         <w:rPr/>
-        <w:t xml:space="preserve">7.1 </w:t>
-      </w:r>
-      <w:r>
-        <w:rPr>
-          <w:rStyle w:val="Strong"/>
-        </w:rPr>
-        <w:t>Duplicate</w:t>
-      </w:r>
-      <w:r>
-        <w:rPr/>
-        <w:t xml:space="preserve"> (you paid twice for one booking or plan), </w:t>
+        <w:t xml:space="preserve">7.1 Each of these has its own message on the booking page and in the app: </w:t>
+      </w:r>
+      <w:r>
+        <w:rPr>
+          <w:rStyle w:val="Strong"/>
+        </w:rPr>
+        <w:t>duplicate</w:t>
+      </w:r>
+      <w:r>
+        <w:rPr/>
+        <w:t xml:space="preserve"> (you paid twice for one booking; the booking stays confirmed and the extra payment is refunded), </w:t>
       </w:r>
       <w:r>
         <w:rPr>
@@ -11890,6 +11844,26 @@
       </w:r>
       <w:r>
         <w:rPr/>
+        <w:t xml:space="preserve"> and </w:t>
+      </w:r>
+      <w:r>
+        <w:rPr>
+          <w:rStyle w:val="Strong"/>
+        </w:rPr>
+        <w:t>time taken</w:t>
+      </w:r>
+      <w:r>
+        <w:rPr/>
+        <w:t xml:space="preserve">. A second click or a second browser tab on the same booking re-uses the same open payment, so it does not create a second charge. Duplicate (you paid twice for one booking or plan), </w:t>
+      </w:r>
+      <w:r>
+        <w:rPr>
+          <w:rStyle w:val="Strong"/>
+        </w:rPr>
+        <w:t>too late</w:t>
+      </w:r>
+      <w:r>
+        <w:rPr/>
         <w:t xml:space="preserve"> (the payment arrived after the attempt closed and the time was no longer free, or you had cancelled it) and </w:t>
       </w:r>
       <w:r>
@@ -11954,7 +11928,17 @@
       </w:pPr>
       <w:r>
         <w:rPr/>
-        <w:t xml:space="preserve">7.3 If the amount Paystack reports does not match the price (other than Paystack's processing fee), the booking is </w:t>
+        <w:t xml:space="preserve">7.3 If the amount Paystack reports does not match the price (other than Paystack's processing fee), or the payment is </w:t>
+      </w:r>
+      <w:r>
+        <w:rPr>
+          <w:rStyle w:val="Strong"/>
+        </w:rPr>
+        <w:t>not in Nigerian naira (NGN)</w:t>
+      </w:r>
+      <w:r>
+        <w:rPr/>
+        <w:t xml:space="preserve">, the booking is </w:t>
       </w:r>
       <w:r>
         <w:rPr>
@@ -11964,7 +11948,7 @@
       </w:r>
       <w:r>
         <w:rPr/>
-        <w:t>; staff review it, and you are refunded if you were charged wrongly.</w:t>
+        <w:t>. We tell you, TrimSlot staff get an alert and review it, and you are refunded if you were charged wrongly.</w:t>
       </w:r>
     </w:p>
     <w:p>
@@ -11996,7 +11980,7 @@
       </w:r>
       <w:r>
         <w:rPr/>
-        <w:t xml:space="preserve">, which is part of the payment-processor fee (the current share is 33.333%). When a payment is refunded (in-time cancellation, "not served", duplicate, late or slot-taken payment), you get back </w:t>
+        <w:t xml:space="preserve">, shown before you pay. When a payment is refunded (in-time cancellation, "not served", duplicate, late or slot-taken payment), you get back </w:t>
       </w:r>
       <w:r>
         <w:rPr>
@@ -12026,7 +12010,7 @@
       </w:r>
       <w:r>
         <w:rPr/>
-        <w:t>; the booking fee is not turned into credit. Bookings paid by plan session, credit or on arrival have no booking fee. [LAWYER: confirm this treatment; see question 24b.]</w:t>
+        <w:t>; the booking fee is not turned into credit. Bookings paid by plan session, credit or on arrival have no booking fee.</w:t>
       </w:r>
     </w:p>
     <w:p>
@@ -13621,11 +13605,11 @@
         </w:tblCellMar>
       </w:tblPr>
       <w:tblGrid>
-        <w:gridCol w:w="4294"/>
-        <w:gridCol w:w="1434"/>
-        <w:gridCol w:w="1750"/>
-        <w:gridCol w:w="1095"/>
-        <w:gridCol w:w="1632"/>
+        <w:gridCol w:w="3234"/>
+        <w:gridCol w:w="1679"/>
+        <w:gridCol w:w="2199"/>
+        <w:gridCol w:w="1284"/>
+        <w:gridCol w:w="1809"/>
       </w:tblGrid>
       <w:tr>
         <w:trPr>
@@ -13633,7 +13617,7 @@
         </w:trPr>
         <w:tc>
           <w:tcPr>
-            <w:tcW w:w="4294" w:type="dxa"/>
+            <w:tcW w:w="3234" w:type="dxa"/>
             <w:tcBorders>
               <w:top w:val="single" w:sz="6" w:space="0" w:color="808080"/>
               <w:left w:val="single" w:sz="6" w:space="0" w:color="808080"/>
@@ -13659,7 +13643,7 @@
         </w:tc>
         <w:tc>
           <w:tcPr>
-            <w:tcW w:w="1434" w:type="dxa"/>
+            <w:tcW w:w="1679" w:type="dxa"/>
             <w:tcBorders>
               <w:top w:val="single" w:sz="6" w:space="0" w:color="808080"/>
               <w:left w:val="single" w:sz="2" w:space="0" w:color="808080"/>
@@ -13685,7 +13669,7 @@
         </w:tc>
         <w:tc>
           <w:tcPr>
-            <w:tcW w:w="1750" w:type="dxa"/>
+            <w:tcW w:w="2199" w:type="dxa"/>
             <w:tcBorders>
               <w:top w:val="single" w:sz="6" w:space="0" w:color="808080"/>
               <w:left w:val="single" w:sz="2" w:space="0" w:color="808080"/>
@@ -13711,7 +13695,7 @@
         </w:tc>
         <w:tc>
           <w:tcPr>
-            <w:tcW w:w="1095" w:type="dxa"/>
+            <w:tcW w:w="1284" w:type="dxa"/>
             <w:tcBorders>
               <w:top w:val="single" w:sz="6" w:space="0" w:color="808080"/>
               <w:left w:val="single" w:sz="2" w:space="0" w:color="808080"/>
@@ -13737,7 +13721,7 @@
         </w:tc>
         <w:tc>
           <w:tcPr>
-            <w:tcW w:w="1632" w:type="dxa"/>
+            <w:tcW w:w="1809" w:type="dxa"/>
             <w:tcBorders>
               <w:top w:val="single" w:sz="6" w:space="0" w:color="808080"/>
               <w:left w:val="single" w:sz="2" w:space="0" w:color="808080"/>
@@ -13766,7 +13750,7 @@
         <w:trPr/>
         <w:tc>
           <w:tcPr>
-            <w:tcW w:w="4294" w:type="dxa"/>
+            <w:tcW w:w="3234" w:type="dxa"/>
             <w:tcBorders>
               <w:left w:val="single" w:sz="6" w:space="0" w:color="808080"/>
               <w:bottom w:val="single" w:sz="2" w:space="0" w:color="808080"/>
@@ -13793,7 +13777,7 @@
         </w:tc>
         <w:tc>
           <w:tcPr>
-            <w:tcW w:w="1434" w:type="dxa"/>
+            <w:tcW w:w="1679" w:type="dxa"/>
             <w:tcBorders>
               <w:left w:val="single" w:sz="2" w:space="0" w:color="808080"/>
               <w:bottom w:val="single" w:sz="2" w:space="0" w:color="808080"/>
@@ -13828,7 +13812,7 @@
         </w:tc>
         <w:tc>
           <w:tcPr>
-            <w:tcW w:w="1750" w:type="dxa"/>
+            <w:tcW w:w="2199" w:type="dxa"/>
             <w:tcBorders>
               <w:left w:val="single" w:sz="2" w:space="0" w:color="808080"/>
               <w:bottom w:val="single" w:sz="2" w:space="0" w:color="808080"/>
@@ -13853,7 +13837,7 @@
         </w:tc>
         <w:tc>
           <w:tcPr>
-            <w:tcW w:w="1095" w:type="dxa"/>
+            <w:tcW w:w="1284" w:type="dxa"/>
             <w:tcBorders>
               <w:left w:val="single" w:sz="2" w:space="0" w:color="808080"/>
               <w:bottom w:val="single" w:sz="2" w:space="0" w:color="808080"/>
@@ -13884,7 +13868,7 @@
         </w:tc>
         <w:tc>
           <w:tcPr>
-            <w:tcW w:w="1632" w:type="dxa"/>
+            <w:tcW w:w="1809" w:type="dxa"/>
             <w:tcBorders>
               <w:left w:val="single" w:sz="2" w:space="0" w:color="808080"/>
               <w:bottom w:val="single" w:sz="2" w:space="0" w:color="808080"/>
@@ -13912,7 +13896,7 @@
         <w:trPr/>
         <w:tc>
           <w:tcPr>
-            <w:tcW w:w="4294" w:type="dxa"/>
+            <w:tcW w:w="3234" w:type="dxa"/>
             <w:tcBorders>
               <w:left w:val="single" w:sz="6" w:space="0" w:color="808080"/>
               <w:bottom w:val="single" w:sz="2" w:space="0" w:color="808080"/>
@@ -13939,7 +13923,7 @@
         </w:tc>
         <w:tc>
           <w:tcPr>
-            <w:tcW w:w="1434" w:type="dxa"/>
+            <w:tcW w:w="1679" w:type="dxa"/>
             <w:tcBorders>
               <w:left w:val="single" w:sz="2" w:space="0" w:color="808080"/>
               <w:bottom w:val="single" w:sz="2" w:space="0" w:color="808080"/>
@@ -13964,7 +13948,7 @@
         </w:tc>
         <w:tc>
           <w:tcPr>
-            <w:tcW w:w="1750" w:type="dxa"/>
+            <w:tcW w:w="2199" w:type="dxa"/>
             <w:tcBorders>
               <w:left w:val="single" w:sz="2" w:space="0" w:color="808080"/>
               <w:bottom w:val="single" w:sz="2" w:space="0" w:color="808080"/>
@@ -13989,7 +13973,7 @@
         </w:tc>
         <w:tc>
           <w:tcPr>
-            <w:tcW w:w="1095" w:type="dxa"/>
+            <w:tcW w:w="1284" w:type="dxa"/>
             <w:tcBorders>
               <w:left w:val="single" w:sz="2" w:space="0" w:color="808080"/>
               <w:bottom w:val="single" w:sz="2" w:space="0" w:color="808080"/>
@@ -14014,7 +13998,7 @@
         </w:tc>
         <w:tc>
           <w:tcPr>
-            <w:tcW w:w="1632" w:type="dxa"/>
+            <w:tcW w:w="1809" w:type="dxa"/>
             <w:tcBorders>
               <w:left w:val="single" w:sz="2" w:space="0" w:color="808080"/>
               <w:bottom w:val="single" w:sz="2" w:space="0" w:color="808080"/>
@@ -14042,7 +14026,7 @@
         <w:trPr/>
         <w:tc>
           <w:tcPr>
-            <w:tcW w:w="4294" w:type="dxa"/>
+            <w:tcW w:w="3234" w:type="dxa"/>
             <w:tcBorders>
               <w:left w:val="single" w:sz="6" w:space="0" w:color="808080"/>
               <w:bottom w:val="single" w:sz="2" w:space="0" w:color="808080"/>
@@ -14079,7 +14063,7 @@
         </w:tc>
         <w:tc>
           <w:tcPr>
-            <w:tcW w:w="1434" w:type="dxa"/>
+            <w:tcW w:w="1679" w:type="dxa"/>
             <w:tcBorders>
               <w:left w:val="single" w:sz="2" w:space="0" w:color="808080"/>
               <w:bottom w:val="single" w:sz="2" w:space="0" w:color="808080"/>
@@ -14104,7 +14088,7 @@
         </w:tc>
         <w:tc>
           <w:tcPr>
-            <w:tcW w:w="1750" w:type="dxa"/>
+            <w:tcW w:w="2199" w:type="dxa"/>
             <w:tcBorders>
               <w:left w:val="single" w:sz="2" w:space="0" w:color="808080"/>
               <w:bottom w:val="single" w:sz="2" w:space="0" w:color="808080"/>
@@ -14129,7 +14113,7 @@
         </w:tc>
         <w:tc>
           <w:tcPr>
-            <w:tcW w:w="1095" w:type="dxa"/>
+            <w:tcW w:w="1284" w:type="dxa"/>
             <w:tcBorders>
               <w:left w:val="single" w:sz="2" w:space="0" w:color="808080"/>
               <w:bottom w:val="single" w:sz="2" w:space="0" w:color="808080"/>
@@ -14154,7 +14138,7 @@
         </w:tc>
         <w:tc>
           <w:tcPr>
-            <w:tcW w:w="1632" w:type="dxa"/>
+            <w:tcW w:w="1809" w:type="dxa"/>
             <w:tcBorders>
               <w:left w:val="single" w:sz="2" w:space="0" w:color="808080"/>
               <w:bottom w:val="single" w:sz="2" w:space="0" w:color="808080"/>
@@ -14182,7 +14166,7 @@
         <w:trPr/>
         <w:tc>
           <w:tcPr>
-            <w:tcW w:w="4294" w:type="dxa"/>
+            <w:tcW w:w="3234" w:type="dxa"/>
             <w:tcBorders>
               <w:left w:val="single" w:sz="6" w:space="0" w:color="808080"/>
               <w:bottom w:val="single" w:sz="2" w:space="0" w:color="808080"/>
@@ -14209,7 +14193,7 @@
         </w:tc>
         <w:tc>
           <w:tcPr>
-            <w:tcW w:w="1434" w:type="dxa"/>
+            <w:tcW w:w="1679" w:type="dxa"/>
             <w:tcBorders>
               <w:left w:val="single" w:sz="2" w:space="0" w:color="808080"/>
               <w:bottom w:val="single" w:sz="2" w:space="0" w:color="808080"/>
@@ -14234,7 +14218,7 @@
         </w:tc>
         <w:tc>
           <w:tcPr>
-            <w:tcW w:w="1750" w:type="dxa"/>
+            <w:tcW w:w="2199" w:type="dxa"/>
             <w:tcBorders>
               <w:left w:val="single" w:sz="2" w:space="0" w:color="808080"/>
               <w:bottom w:val="single" w:sz="2" w:space="0" w:color="808080"/>
@@ -14259,7 +14243,7 @@
         </w:tc>
         <w:tc>
           <w:tcPr>
-            <w:tcW w:w="1095" w:type="dxa"/>
+            <w:tcW w:w="1284" w:type="dxa"/>
             <w:tcBorders>
               <w:left w:val="single" w:sz="2" w:space="0" w:color="808080"/>
               <w:bottom w:val="single" w:sz="2" w:space="0" w:color="808080"/>
@@ -14284,7 +14268,7 @@
         </w:tc>
         <w:tc>
           <w:tcPr>
-            <w:tcW w:w="1632" w:type="dxa"/>
+            <w:tcW w:w="1809" w:type="dxa"/>
             <w:tcBorders>
               <w:left w:val="single" w:sz="2" w:space="0" w:color="808080"/>
               <w:bottom w:val="single" w:sz="2" w:space="0" w:color="808080"/>
@@ -14312,7 +14296,7 @@
         <w:trPr/>
         <w:tc>
           <w:tcPr>
-            <w:tcW w:w="4294" w:type="dxa"/>
+            <w:tcW w:w="3234" w:type="dxa"/>
             <w:tcBorders>
               <w:left w:val="single" w:sz="6" w:space="0" w:color="808080"/>
               <w:bottom w:val="single" w:sz="2" w:space="0" w:color="808080"/>
@@ -14339,7 +14323,7 @@
         </w:tc>
         <w:tc>
           <w:tcPr>
-            <w:tcW w:w="1434" w:type="dxa"/>
+            <w:tcW w:w="1679" w:type="dxa"/>
             <w:tcBorders>
               <w:left w:val="single" w:sz="2" w:space="0" w:color="808080"/>
               <w:bottom w:val="single" w:sz="2" w:space="0" w:color="808080"/>
@@ -14364,7 +14348,7 @@
         </w:tc>
         <w:tc>
           <w:tcPr>
-            <w:tcW w:w="1750" w:type="dxa"/>
+            <w:tcW w:w="2199" w:type="dxa"/>
             <w:tcBorders>
               <w:left w:val="single" w:sz="2" w:space="0" w:color="808080"/>
               <w:bottom w:val="single" w:sz="2" w:space="0" w:color="808080"/>
@@ -14389,7 +14373,7 @@
         </w:tc>
         <w:tc>
           <w:tcPr>
-            <w:tcW w:w="1095" w:type="dxa"/>
+            <w:tcW w:w="1284" w:type="dxa"/>
             <w:tcBorders>
               <w:left w:val="single" w:sz="2" w:space="0" w:color="808080"/>
               <w:bottom w:val="single" w:sz="2" w:space="0" w:color="808080"/>
@@ -14414,7 +14398,7 @@
         </w:tc>
         <w:tc>
           <w:tcPr>
-            <w:tcW w:w="1632" w:type="dxa"/>
+            <w:tcW w:w="1809" w:type="dxa"/>
             <w:tcBorders>
               <w:left w:val="single" w:sz="2" w:space="0" w:color="808080"/>
               <w:bottom w:val="single" w:sz="2" w:space="0" w:color="808080"/>
@@ -14442,7 +14426,7 @@
         <w:trPr/>
         <w:tc>
           <w:tcPr>
-            <w:tcW w:w="4294" w:type="dxa"/>
+            <w:tcW w:w="3234" w:type="dxa"/>
             <w:tcBorders>
               <w:left w:val="single" w:sz="6" w:space="0" w:color="808080"/>
               <w:bottom w:val="single" w:sz="2" w:space="0" w:color="808080"/>
@@ -14467,7 +14451,7 @@
         </w:tc>
         <w:tc>
           <w:tcPr>
-            <w:tcW w:w="1434" w:type="dxa"/>
+            <w:tcW w:w="1679" w:type="dxa"/>
             <w:tcBorders>
               <w:left w:val="single" w:sz="2" w:space="0" w:color="808080"/>
               <w:bottom w:val="single" w:sz="2" w:space="0" w:color="808080"/>
@@ -14492,7 +14476,7 @@
         </w:tc>
         <w:tc>
           <w:tcPr>
-            <w:tcW w:w="1750" w:type="dxa"/>
+            <w:tcW w:w="2199" w:type="dxa"/>
             <w:tcBorders>
               <w:left w:val="single" w:sz="2" w:space="0" w:color="808080"/>
               <w:bottom w:val="single" w:sz="2" w:space="0" w:color="808080"/>
@@ -14517,7 +14501,7 @@
         </w:tc>
         <w:tc>
           <w:tcPr>
-            <w:tcW w:w="1095" w:type="dxa"/>
+            <w:tcW w:w="1284" w:type="dxa"/>
             <w:tcBorders>
               <w:left w:val="single" w:sz="2" w:space="0" w:color="808080"/>
               <w:bottom w:val="single" w:sz="2" w:space="0" w:color="808080"/>
@@ -14542,7 +14526,7 @@
         </w:tc>
         <w:tc>
           <w:tcPr>
-            <w:tcW w:w="1632" w:type="dxa"/>
+            <w:tcW w:w="1809" w:type="dxa"/>
             <w:tcBorders>
               <w:left w:val="single" w:sz="2" w:space="0" w:color="808080"/>
               <w:bottom w:val="single" w:sz="2" w:space="0" w:color="808080"/>
@@ -14570,7 +14554,7 @@
         <w:trPr/>
         <w:tc>
           <w:tcPr>
-            <w:tcW w:w="4294" w:type="dxa"/>
+            <w:tcW w:w="3234" w:type="dxa"/>
             <w:tcBorders>
               <w:left w:val="single" w:sz="6" w:space="0" w:color="808080"/>
               <w:bottom w:val="single" w:sz="2" w:space="0" w:color="808080"/>
@@ -14601,7 +14585,7 @@
         </w:tc>
         <w:tc>
           <w:tcPr>
-            <w:tcW w:w="1434" w:type="dxa"/>
+            <w:tcW w:w="1679" w:type="dxa"/>
             <w:tcBorders>
               <w:left w:val="single" w:sz="2" w:space="0" w:color="808080"/>
               <w:bottom w:val="single" w:sz="2" w:space="0" w:color="808080"/>
@@ -14626,7 +14610,7 @@
         </w:tc>
         <w:tc>
           <w:tcPr>
-            <w:tcW w:w="1750" w:type="dxa"/>
+            <w:tcW w:w="2199" w:type="dxa"/>
             <w:tcBorders>
               <w:left w:val="single" w:sz="2" w:space="0" w:color="808080"/>
               <w:bottom w:val="single" w:sz="2" w:space="0" w:color="808080"/>
@@ -14651,7 +14635,7 @@
         </w:tc>
         <w:tc>
           <w:tcPr>
-            <w:tcW w:w="1095" w:type="dxa"/>
+            <w:tcW w:w="1284" w:type="dxa"/>
             <w:tcBorders>
               <w:left w:val="single" w:sz="2" w:space="0" w:color="808080"/>
               <w:bottom w:val="single" w:sz="2" w:space="0" w:color="808080"/>
@@ -14676,7 +14660,7 @@
         </w:tc>
         <w:tc>
           <w:tcPr>
-            <w:tcW w:w="1632" w:type="dxa"/>
+            <w:tcW w:w="1809" w:type="dxa"/>
             <w:tcBorders>
               <w:left w:val="single" w:sz="2" w:space="0" w:color="808080"/>
               <w:bottom w:val="single" w:sz="2" w:space="0" w:color="808080"/>
@@ -14704,7 +14688,7 @@
         <w:trPr/>
         <w:tc>
           <w:tcPr>
-            <w:tcW w:w="4294" w:type="dxa"/>
+            <w:tcW w:w="3234" w:type="dxa"/>
             <w:tcBorders>
               <w:left w:val="single" w:sz="6" w:space="0" w:color="808080"/>
               <w:bottom w:val="single" w:sz="2" w:space="0" w:color="808080"/>
@@ -14722,120 +14706,14 @@
               <w:rPr/>
             </w:pPr>
             <w:r>
-              <w:rPr>
-                <w:rStyle w:val="SourceText"/>
-              </w:rPr>
-              <w:t>adm_sf_customers</w:t>
-            </w:r>
-            <w:r>
-              <w:rPr/>
-              <w:t xml:space="preserve">, </w:t>
-            </w:r>
-            <w:r>
-              <w:rPr>
-                <w:rStyle w:val="SourceText"/>
-              </w:rPr>
-              <w:t>adm_sf_barbers</w:t>
-            </w:r>
-            <w:r>
-              <w:rPr/>
-              <w:t xml:space="preserve">, </w:t>
-            </w:r>
-            <w:r>
-              <w:rPr>
-                <w:rStyle w:val="SourceText"/>
-              </w:rPr>
-              <w:t>adm_sf_bookings</w:t>
-            </w:r>
-            <w:r>
-              <w:rPr/>
-              <w:t xml:space="preserve">, </w:t>
-            </w:r>
-            <w:r>
-              <w:rPr>
-                <w:rStyle w:val="SourceText"/>
-              </w:rPr>
-              <w:t>adm_sf_payments</w:t>
-            </w:r>
-            <w:r>
-              <w:rPr/>
-              <w:t xml:space="preserve">, </w:t>
-            </w:r>
-            <w:r>
-              <w:rPr>
-                <w:rStyle w:val="SourceText"/>
-              </w:rPr>
-              <w:t>adm_sf_credits</w:t>
-            </w:r>
-            <w:r>
-              <w:rPr/>
-              <w:t xml:space="preserve">, </w:t>
-            </w:r>
-            <w:r>
-              <w:rPr>
-                <w:rStyle w:val="SourceText"/>
-              </w:rPr>
-              <w:t>adm_sf_reports</w:t>
-            </w:r>
-            <w:r>
-              <w:rPr/>
-              <w:t xml:space="preserve">, </w:t>
-            </w:r>
-            <w:r>
-              <w:rPr>
-                <w:rStyle w:val="SourceText"/>
-              </w:rPr>
-              <w:t>adm_sf_ledger</w:t>
-            </w:r>
-            <w:r>
-              <w:rPr/>
-              <w:t xml:space="preserve">, </w:t>
-            </w:r>
-            <w:r>
-              <w:rPr>
-                <w:rStyle w:val="SourceText"/>
-              </w:rPr>
-              <w:t>adm_sf_reviews</w:t>
-            </w:r>
-            <w:r>
-              <w:rPr/>
-              <w:t xml:space="preserve">, </w:t>
-            </w:r>
-            <w:r>
-              <w:rPr>
-                <w:rStyle w:val="SourceText"/>
-              </w:rPr>
-              <w:t>adm_sf_waitlist</w:t>
-            </w:r>
-            <w:r>
-              <w:rPr/>
-              <w:t xml:space="preserve">, </w:t>
-            </w:r>
-            <w:r>
-              <w:rPr>
-                <w:rStyle w:val="SourceText"/>
-              </w:rPr>
-              <w:t>adm_sf_purchases</w:t>
-            </w:r>
-            <w:r>
-              <w:rPr/>
-              <w:t xml:space="preserve">, </w:t>
-            </w:r>
-            <w:r>
-              <w:rPr>
-                <w:rStyle w:val="SourceText"/>
-              </w:rPr>
-              <w:t>adm_sf_plans</w:t>
-            </w:r>
-            <w:r>
-              <w:rPr/>
-              <w:t xml:space="preserve"> (staff only)</w:t>
-            </w:r>
-          </w:p>
-        </w:tc>
-        <w:tc>
-          <w:tcPr>
-            <w:tcW w:w="1434" w:type="dxa"/>
+              <w:rPr/>
+              <w:t>Saved filter views for admin lists (staff only)</w:t>
+            </w:r>
+          </w:p>
+        </w:tc>
+        <w:tc>
+          <w:tcPr>
+            <w:tcW w:w="1679" w:type="dxa"/>
             <w:tcBorders>
               <w:left w:val="single" w:sz="2" w:space="0" w:color="808080"/>
               <w:bottom w:val="single" w:sz="2" w:space="0" w:color="808080"/>
@@ -14860,7 +14738,7 @@
         </w:tc>
         <w:tc>
           <w:tcPr>
-            <w:tcW w:w="1750" w:type="dxa"/>
+            <w:tcW w:w="2199" w:type="dxa"/>
             <w:tcBorders>
               <w:left w:val="single" w:sz="2" w:space="0" w:color="808080"/>
               <w:bottom w:val="single" w:sz="2" w:space="0" w:color="808080"/>
@@ -14885,7 +14763,7 @@
         </w:tc>
         <w:tc>
           <w:tcPr>
-            <w:tcW w:w="1095" w:type="dxa"/>
+            <w:tcW w:w="1284" w:type="dxa"/>
             <w:tcBorders>
               <w:left w:val="single" w:sz="2" w:space="0" w:color="808080"/>
               <w:bottom w:val="single" w:sz="2" w:space="0" w:color="808080"/>
@@ -14910,7 +14788,7 @@
         </w:tc>
         <w:tc>
           <w:tcPr>
-            <w:tcW w:w="1632" w:type="dxa"/>
+            <w:tcW w:w="1809" w:type="dxa"/>
             <w:tcBorders>
               <w:left w:val="single" w:sz="2" w:space="0" w:color="808080"/>
               <w:bottom w:val="single" w:sz="2" w:space="0" w:color="808080"/>
@@ -14938,7 +14816,7 @@
         <w:trPr/>
         <w:tc>
           <w:tcPr>
-            <w:tcW w:w="4294" w:type="dxa"/>
+            <w:tcW w:w="3234" w:type="dxa"/>
             <w:tcBorders>
               <w:left w:val="single" w:sz="6" w:space="0" w:color="808080"/>
               <w:bottom w:val="single" w:sz="6" w:space="0" w:color="808080"/>
@@ -14963,7 +14841,7 @@
         </w:tc>
         <w:tc>
           <w:tcPr>
-            <w:tcW w:w="1434" w:type="dxa"/>
+            <w:tcW w:w="1679" w:type="dxa"/>
             <w:tcBorders>
               <w:left w:val="single" w:sz="2" w:space="0" w:color="808080"/>
               <w:bottom w:val="single" w:sz="6" w:space="0" w:color="808080"/>
@@ -14988,7 +14866,7 @@
         </w:tc>
         <w:tc>
           <w:tcPr>
-            <w:tcW w:w="1750" w:type="dxa"/>
+            <w:tcW w:w="2199" w:type="dxa"/>
             <w:tcBorders>
               <w:left w:val="single" w:sz="2" w:space="0" w:color="808080"/>
               <w:bottom w:val="single" w:sz="6" w:space="0" w:color="808080"/>
@@ -15013,7 +14891,7 @@
         </w:tc>
         <w:tc>
           <w:tcPr>
-            <w:tcW w:w="1095" w:type="dxa"/>
+            <w:tcW w:w="1284" w:type="dxa"/>
             <w:tcBorders>
               <w:left w:val="single" w:sz="2" w:space="0" w:color="808080"/>
               <w:bottom w:val="single" w:sz="6" w:space="0" w:color="808080"/>
@@ -15038,7 +14916,7 @@
         </w:tc>
         <w:tc>
           <w:tcPr>
-            <w:tcW w:w="1632" w:type="dxa"/>
+            <w:tcW w:w="1809" w:type="dxa"/>
             <w:tcBorders>
               <w:left w:val="single" w:sz="2" w:space="0" w:color="808080"/>
               <w:bottom w:val="single" w:sz="6" w:space="0" w:color="808080"/>
@@ -15477,7 +15355,7 @@
       </w:r>
       <w:r>
         <w:rPr/>
-        <w:t xml:space="preserve"> can turn on push alerts for refunds waiting, auto-approved refunds, refund failures and deletion requests (with quiet hours); they are separate from customer notifications. </w:t>
+        <w:t xml:space="preserve"> can turn on push alerts for payments, refunds and requests that need attention (with quiet hours); they are separate from customer notifications. </w:t>
       </w:r>
     </w:p>
     <w:p>
@@ -15719,6 +15597,24 @@
       <w:r>
         <w:rPr/>
         <w:t>Compliance Checklist (short)</w:t>
+      </w:r>
+    </w:p>
+    <w:p>
+      <w:pPr>
+        <w:pStyle w:val="BlockQuotation"/>
+        <w:bidi w:val="0"/>
+        <w:jc w:val="left"/>
+        <w:rPr/>
+      </w:pPr>
+      <w:r>
+        <w:rPr>
+          <w:rStyle w:val="Strong"/>
+        </w:rPr>
+        <w:t>INTERNAL – for the owner and the lawyer only. Do NOT publish this file or the legal pack</w:t>
+      </w:r>
+      <w:r>
+        <w:rPr/>
+        <w:t xml:space="preserve"> (no web page, no public repository, no app screen). It contains business details such as fees, charges, the split of processing costs and internal settings. Only files 01–06 are turned into public pages, and they must not quote those numbers.</w:t>
       </w:r>
     </w:p>
     <w:p>
@@ -21866,6 +21762,24 @@
         <w:rPr>
           <w:rStyle w:val="Strong"/>
         </w:rPr>
+        <w:t>INTERNAL – for the owner and the lawyer only. Do NOT publish this file or the legal pack</w:t>
+      </w:r>
+      <w:r>
+        <w:rPr/>
+        <w:t xml:space="preserve"> (no web page, no public repository, no app screen). It contains business details such as fees, charges, the split of processing costs and internal settings. Only files 01–06 are turned into public pages, and they must not quote those numbers.</w:t>
+      </w:r>
+    </w:p>
+    <w:p>
+      <w:pPr>
+        <w:pStyle w:val="BlockQuotation"/>
+        <w:bidi w:val="0"/>
+        <w:jc w:val="left"/>
+        <w:rPr/>
+      </w:pPr>
+      <w:r>
+        <w:rPr>
+          <w:rStyle w:val="Strong"/>
+        </w:rPr>
         <w:t>DRAFT – not legal advice – lawyer review required.</w:t>
       </w:r>
       <w:r>
@@ -23228,7 +23142,57 @@
             </w:r>
             <w:r>
               <w:rPr/>
-              <w:t xml:space="preserve">, admin setting); then it is closed lazily and by the sweeper → "Incomplete", no charge, barber never sees it. </w:t>
+              <w:t xml:space="preserve">, admin setting); Starting to pay extends the try to now + </w:t>
+            </w:r>
+            <w:r>
+              <w:rPr>
+                <w:rStyle w:val="SourceText"/>
+              </w:rPr>
+              <w:t>payment_hold_min</w:t>
+            </w:r>
+            <w:r>
+              <w:rPr/>
+              <w:t xml:space="preserve">, never beyond 4 × </w:t>
+            </w:r>
+            <w:r>
+              <w:rPr>
+                <w:rStyle w:val="SourceText"/>
+              </w:rPr>
+              <w:t>payment_hold_min</w:t>
+            </w:r>
+            <w:r>
+              <w:rPr/>
+              <w:t xml:space="preserve"> from when the try was made; pressing Pay again re-uses the same open Paystack checkout (same reference) instead of making another. Before a try is closed (lazy close or sweeper), </w:t>
+            </w:r>
+            <w:r>
+              <w:rPr>
+                <w:rStyle w:val="SourceText"/>
+              </w:rPr>
+              <w:t>verifyBeforeClosing</w:t>
+            </w:r>
+            <w:r>
+              <w:rPr/>
+              <w:t xml:space="preserve"> asks Paystack about its INITIATED payments (throttled 2 min per reference through </w:t>
+            </w:r>
+            <w:r>
+              <w:rPr>
+                <w:rStyle w:val="SourceText"/>
+              </w:rPr>
+              <w:t>rate_limits</w:t>
+            </w:r>
+            <w:r>
+              <w:rPr/>
+              <w:t>): paid → confirmed or refunded as below; not paid → "Incomplete" with "You were not charged"; Paystack unreachable → kept open up to 60 min after the hold ended, then closed with a hedged message (no "not charged"). The sweeper (</w:t>
+            </w:r>
+            <w:r>
+              <w:rPr>
+                <w:rStyle w:val="SourceText"/>
+              </w:rPr>
+              <w:t>reconcileRecentPayments</w:t>
+            </w:r>
+            <w:r>
+              <w:rPr/>
+              <w:t xml:space="preserve">, 10-min throttle) also re-checks INITIATED booking payments created in the last 48 h whose booking is Incomplete or still pending. → "Incomplete", barber never sees it. </w:t>
             </w:r>
             <w:r>
               <w:rPr>
@@ -23370,7 +23334,107 @@
             </w:r>
             <w:r>
               <w:rPr/>
-              <w:t>; refund requested from Paystack automatically; failed refund calls retried by the sweeper. The customer gets a notification in all three cases (duplicate: "We got a second payment. Your refund is coming."). A late payment for a time that is still free confirms the booking instead (see Unpaid try).</w:t>
+              <w:t>; refund requested from Paystack automatically; failed refund calls retried by the sweeper. The customer gets a notification in all three cases (duplicate: "We got a second payment. Your refund is coming."). Each has its own result (</w:t>
+            </w:r>
+            <w:r>
+              <w:rPr>
+                <w:rStyle w:val="SourceText"/>
+              </w:rPr>
+              <w:t>duplicate_refund</w:t>
+            </w:r>
+            <w:r>
+              <w:rPr/>
+              <w:t xml:space="preserve">, </w:t>
+            </w:r>
+            <w:r>
+              <w:rPr>
+                <w:rStyle w:val="SourceText"/>
+              </w:rPr>
+              <w:t>late_refund</w:t>
+            </w:r>
+            <w:r>
+              <w:rPr/>
+              <w:t xml:space="preserve">, </w:t>
+            </w:r>
+            <w:r>
+              <w:rPr>
+                <w:rStyle w:val="SourceText"/>
+              </w:rPr>
+              <w:t>slot_taken</w:t>
+            </w:r>
+            <w:r>
+              <w:rPr/>
+              <w:t xml:space="preserve">), kept when asked again, and its own text on the booking page (derived from the booking and payment on every load, so it survives the 10-second refresh; a cancelled booking never says "confirmed"). </w:t>
+            </w:r>
+            <w:r>
+              <w:rPr>
+                <w:rStyle w:val="Strong"/>
+              </w:rPr>
+              <w:t>Amount or currency mismatch</w:t>
+            </w:r>
+            <w:r>
+              <w:rPr/>
+              <w:t xml:space="preserve"> (</w:t>
+            </w:r>
+            <w:r>
+              <w:rPr>
+                <w:rStyle w:val="SourceText"/>
+              </w:rPr>
+              <w:t>amount_mismatch</w:t>
+            </w:r>
+            <w:r>
+              <w:rPr/>
+              <w:t xml:space="preserve">: amount ≠ price + booking fee within tolerance, or currency present and not NGN): not confirmed, not auto-refunded; audit </w:t>
+            </w:r>
+            <w:r>
+              <w:rPr>
+                <w:rStyle w:val="SourceText"/>
+              </w:rPr>
+              <w:t>PAYMENT_AMOUNT_MISMATCH</w:t>
+            </w:r>
+            <w:r>
+              <w:rPr/>
+              <w:t xml:space="preserve">, customer notification </w:t>
+            </w:r>
+            <w:r>
+              <w:rPr>
+                <w:rStyle w:val="SourceText"/>
+              </w:rPr>
+              <w:t>PAYMENT_PROBLEM</w:t>
+            </w:r>
+            <w:r>
+              <w:rPr/>
+              <w:t xml:space="preserve">, admin alert </w:t>
+            </w:r>
+            <w:r>
+              <w:rPr>
+                <w:rStyle w:val="SourceText"/>
+              </w:rPr>
+              <w:t>PAYMENT_MISMATCH</w:t>
+            </w:r>
+            <w:r>
+              <w:rPr/>
+              <w:t xml:space="preserve"> (24 h dedupe). The payment callback never fails with an error page: on any error it redirects to </w:t>
+            </w:r>
+            <w:r>
+              <w:rPr>
+                <w:rStyle w:val="SourceText"/>
+              </w:rPr>
+              <w:t>/#/booking/&lt;id&gt;?pay=checked</w:t>
+            </w:r>
+            <w:r>
+              <w:rPr/>
+              <w:t xml:space="preserve">, and an unknown reference goes to </w:t>
+            </w:r>
+            <w:r>
+              <w:rPr>
+                <w:rStyle w:val="SourceText"/>
+              </w:rPr>
+              <w:t>/#/bookings</w:t>
+            </w:r>
+            <w:r>
+              <w:rPr/>
+              <w:t>. A late payment for a time that is still free confirms the booking instead (see Unpaid try).</w:t>
             </w:r>
           </w:p>
         </w:tc>
@@ -26351,6 +26415,114 @@
               <w:rPr>
                 <w:rStyle w:val="Strong"/>
               </w:rPr>
+              <w:t>What is published</w:t>
+            </w:r>
+          </w:p>
+        </w:tc>
+        <w:tc>
+          <w:tcPr>
+            <w:tcW w:w="4191" w:type="dxa"/>
+            <w:tcBorders>
+              <w:left w:val="single" w:sz="2" w:space="0" w:color="808080"/>
+              <w:bottom w:val="single" w:sz="2" w:space="0" w:color="808080"/>
+              <w:right w:val="single" w:sz="6" w:space="0" w:color="808080"/>
+            </w:tcBorders>
+            <w:vAlign w:val="center"/>
+          </w:tcPr>
+          <w:p>
+            <w:pPr>
+              <w:pStyle w:val="TableContents"/>
+              <w:widowControl w:val="false"/>
+              <w:suppressLineNumbers/>
+              <w:bidi w:val="0"/>
+              <w:jc w:val="left"/>
+              <w:rPr/>
+            </w:pPr>
+            <w:r>
+              <w:rPr>
+                <w:rStyle w:val="SourceText"/>
+              </w:rPr>
+              <w:t>GET /api/public-settings</w:t>
+            </w:r>
+            <w:r>
+              <w:rPr/>
+              <w:t xml:space="preserve"> serves only the numbers the public pages quote (cancel window, payment hold, credit expiry, plan limits, retention periods, liability cap, loyalty, versions). Fees, charge, the processing-fee split, commission, payout floor, debt limits and the refund auto-approve time are NOT served; </w:t>
+            </w:r>
+            <w:r>
+              <w:rPr>
+                <w:rStyle w:val="SourceText"/>
+              </w:rPr>
+              <w:t>legal/build.py</w:t>
+            </w:r>
+            <w:r>
+              <w:rPr/>
+              <w:t xml:space="preserve"> refuses to build a public page that quotes them.</w:t>
+            </w:r>
+          </w:p>
+        </w:tc>
+        <w:tc>
+          <w:tcPr>
+            <w:tcW w:w="4937" w:type="dxa"/>
+            <w:tcBorders>
+              <w:left w:val="single" w:sz="2" w:space="0" w:color="808080"/>
+              <w:bottom w:val="single" w:sz="2" w:space="0" w:color="808080"/>
+              <w:right w:val="single" w:sz="6" w:space="0" w:color="808080"/>
+            </w:tcBorders>
+            <w:vAlign w:val="center"/>
+          </w:tcPr>
+          <w:p>
+            <w:pPr>
+              <w:pStyle w:val="TableContents"/>
+              <w:widowControl w:val="false"/>
+              <w:suppressLineNumbers/>
+              <w:bidi w:val="0"/>
+              <w:jc w:val="left"/>
+              <w:rPr/>
+            </w:pPr>
+            <w:r>
+              <w:rPr>
+                <w:rStyle w:val="SourceText"/>
+              </w:rPr>
+              <w:t>src/publicSettings.ts</w:t>
+            </w:r>
+            <w:r>
+              <w:rPr/>
+              <w:t xml:space="preserve">, </w:t>
+            </w:r>
+            <w:r>
+              <w:rPr>
+                <w:rStyle w:val="SourceText"/>
+              </w:rPr>
+              <w:t>legal/build.py</w:t>
+            </w:r>
+          </w:p>
+        </w:tc>
+      </w:tr>
+      <w:tr>
+        <w:trPr/>
+        <w:tc>
+          <w:tcPr>
+            <w:tcW w:w="1363" w:type="dxa"/>
+            <w:tcBorders>
+              <w:left w:val="single" w:sz="6" w:space="0" w:color="808080"/>
+              <w:bottom w:val="single" w:sz="2" w:space="0" w:color="808080"/>
+              <w:right w:val="single" w:sz="6" w:space="0" w:color="808080"/>
+            </w:tcBorders>
+            <w:vAlign w:val="center"/>
+          </w:tcPr>
+          <w:p>
+            <w:pPr>
+              <w:pStyle w:val="TableContents"/>
+              <w:widowControl w:val="false"/>
+              <w:suppressLineNumbers/>
+              <w:bidi w:val="0"/>
+              <w:jc w:val="left"/>
+              <w:rPr/>
+            </w:pPr>
+            <w:r>
+              <w:rPr>
+                <w:rStyle w:val="Strong"/>
+              </w:rPr>
               <w:t>Admin alerts</w:t>
             </w:r>
           </w:p>
@@ -26376,7 +26548,7 @@
             </w:pPr>
             <w:r>
               <w:rPr/>
-              <w:t>In-app list + web push to the admin for: refund waiting, refund auto-approved, refund failed (12 h dedupe), barber deletion request. Per-event in-app/push preferences and optional quiet hours (default 22:00–07:00 Lagos, off) hold pushes until quiet hours end. Admin push subscriptions are separate from customer ones.</w:t>
+              <w:t>In-app list + web push to the admin for: refund waiting, refund auto-approved, refund failed (12 h dedupe), payment mismatch (24 h dedupe), barber deletion request. Per-event in-app/push preferences and optional quiet hours (default 22:00–07:00 Lagos, off) hold pushes until quiet hours end. Admin push subscriptions are separate from customer ones.</w:t>
             </w:r>
           </w:p>
         </w:tc>

</xml_diff>

<commit_message>
Barber Agreement and Privacy Policy: no subaccount/split wording (payout account via the payment provider); build guard also refuses those words on public pages; pack rebuilt
</commit_message>
<xml_diff>
--- a/legal/legal-pack.docx
+++ b/legal/legal-pack.docx
@@ -3857,7 +3857,7 @@
       </w:pPr>
       <w:r>
         <w:rPr/>
-        <w:t xml:space="preserve">To get paid online, add your bank account in the app. Paystack sends online payments to your bank account. Until you do this, customers can only pay at your shop. </w:t>
+        <w:t xml:space="preserve">To get paid online, add your bank account in the app. Online card payments are paid out to your bank account through our payment provider. Until you do this, customers can only pay at your shop. </w:t>
       </w:r>
     </w:p>
     <w:p>
@@ -4424,7 +4424,7 @@
       </w:r>
       <w:r>
         <w:rPr/>
-        <w:t xml:space="preserve">. Paystack sends the rest to your bank account after two things are taken from your price: a </w:t>
+        <w:t xml:space="preserve">. the rest is paid to your payout account, through our payment provider, after two things are taken from your price: a </w:t>
       </w:r>
       <w:r>
         <w:rPr>
@@ -4750,7 +4750,7 @@
       </w:pPr>
       <w:r>
         <w:rPr/>
-        <w:t>9. Payouts, bank account and Paystack subaccount</w:t>
+        <w:t>9. Payouts and your payout account</w:t>
       </w:r>
     </w:p>
     <w:p>
@@ -4772,17 +4772,7 @@
       </w:r>
       <w:r>
         <w:rPr/>
-        <w:t xml:space="preserve"> in the app: choose your bank and enter your 10-digit account number. We create a </w:t>
-      </w:r>
-      <w:r>
-        <w:rPr>
-          <w:rStyle w:val="Strong"/>
-        </w:rPr>
-        <w:t>Paystack subaccount</w:t>
-      </w:r>
-      <w:r>
-        <w:rPr/>
-        <w:t xml:space="preserve"> in your name. Online payments are split by Paystack when the customer pays: your share is paid into that bank account by Paystack, on Paystack's settlement schedule, and TrimSlot's charge goes to TrimSlot. </w:t>
+        <w:t xml:space="preserve"> in the app: choose your bank and enter your 10-digit account number. Card payments are paid out to your linked payout account through our payment provider, after any deductions shown in your earnings screen, on the payment provider's settlement schedule. </w:t>
       </w:r>
       <w:r>
         <w:rPr>
@@ -4804,7 +4794,7 @@
       </w:pPr>
       <w:r>
         <w:rPr/>
-        <w:t xml:space="preserve">9.2 We look up the </w:t>
+        <w:t xml:space="preserve">9.2 We check the </w:t>
       </w:r>
       <w:r>
         <w:rPr>
@@ -4814,7 +4804,7 @@
       </w:r>
       <w:r>
         <w:rPr/>
-        <w:t xml:space="preserve"> with Paystack to check that the account belongs to you. If the lookup is unavailable (it sometimes is, especially in Paystack test mode), you may type the account name yourself. It will then be marked </w:t>
+        <w:t xml:space="preserve"> with our payment provider to confirm that the account belongs to you. If the check is unavailable (it sometimes is), you may type the account name yourself. It will then be marked </w:t>
       </w:r>
       <w:r>
         <w:rPr>
@@ -4832,10 +4822,6 @@
         </w:rPr>
         <w:t>You confirm that the account is yours (or your business's) and that the name you type is exactly the name on the account.</w:t>
       </w:r>
-      <w:r>
-        <w:rPr/>
-        <w:t xml:space="preserve"> Paystack also checks the account when it creates the subaccount.</w:t>
-      </w:r>
     </w:p>
     <w:p>
       <w:pPr>
@@ -4856,31 +4842,31 @@
       </w:r>
       <w:r>
         <w:rPr/>
-        <w:t xml:space="preserve"> of the account number, the account name and the Paystack subaccount code — not the full number. Paystack holds the full details.</w:t>
-      </w:r>
-    </w:p>
-    <w:p>
-      <w:pPr>
-        <w:pStyle w:val="BodyText"/>
-        <w:bidi w:val="0"/>
-        <w:jc w:val="left"/>
-        <w:rPr/>
-      </w:pPr>
-      <w:r>
-        <w:rPr/>
-        <w:t>9.4 You are responsible for entering correct details. If money is sent to a wrong account because of what you entered, TrimSlot is not responsible for recovering it. If you change your bank details, we check the account name again and create a new Paystack subaccount; the change applies to payments made after it, not to earlier ones.</w:t>
-      </w:r>
-    </w:p>
-    <w:p>
-      <w:pPr>
-        <w:pStyle w:val="BodyText"/>
-        <w:bidi w:val="0"/>
-        <w:jc w:val="left"/>
-        <w:rPr/>
-      </w:pPr>
-      <w:r>
-        <w:rPr/>
-        <w:t xml:space="preserve">9.5 Paystack's terms apply to settlements. Delays, holds, reversals, chargebacks, disputes and payment-provider fees are governed by Paystack's rules; TrimSlot is not liable for Paystack's acts or delays. </w:t>
+        <w:t xml:space="preserve"> of the account number, the account name and a payout account reference, not the full number. Our payment provider holds the full details.</w:t>
+      </w:r>
+    </w:p>
+    <w:p>
+      <w:pPr>
+        <w:pStyle w:val="BodyText"/>
+        <w:bidi w:val="0"/>
+        <w:jc w:val="left"/>
+        <w:rPr/>
+      </w:pPr>
+      <w:r>
+        <w:rPr/>
+        <w:t>9.4 You are responsible for entering correct details. If money is sent to a wrong account because of what you entered, TrimSlot is not responsible for recovering it. If you change your bank details, we check the account name again; the change applies to payments made after it, not to earlier ones.</w:t>
+      </w:r>
+    </w:p>
+    <w:p>
+      <w:pPr>
+        <w:pStyle w:val="BodyText"/>
+        <w:bidi w:val="0"/>
+        <w:jc w:val="left"/>
+        <w:rPr/>
+      </w:pPr>
+      <w:r>
+        <w:rPr/>
+        <w:t xml:space="preserve">9.5 The payment provider's terms apply to settlements. Delays, holds, reversals, chargebacks, disputes and provider fees are governed by the provider's rules; TrimSlot is not liable for the provider's acts or delays. </w:t>
       </w:r>
       <w:r>
         <w:rPr>
@@ -4890,19 +4876,19 @@
       </w:r>
       <w:r>
         <w:rPr/>
-        <w:t xml:space="preserve"> How Paystack treats your share when a split payment is refunded or charged back is set by Paystack and your bank, and we do not promise any particular result. [LAWYER/OWNER: decide whether TrimSlot should have a right to recover a chargeback or refund from a barber who caused it, and check with Paystack how a refunded split payment is reversed; see questions 17 and 55.]</w:t>
-      </w:r>
-    </w:p>
-    <w:p>
-      <w:pPr>
-        <w:pStyle w:val="BodyText"/>
-        <w:bidi w:val="0"/>
-        <w:jc w:val="left"/>
-        <w:rPr/>
-      </w:pPr>
-      <w:r>
-        <w:rPr/>
-        <w:t>9.6 You may need to complete Paystack's verification (KYC) for your business. Paystack may refuse or close your subaccount; we are not responsible for its decisions.</w:t>
+        <w:t xml:space="preserve"> How your payout is treated when a payment is refunded or charged back is set by the provider and your bank, and we do not promise any particular result. [LAWYER/OWNER: decide whether TrimSlot should have a right to recover a chargeback or refund from a barber who caused it, and check with Paystack how a refunded payment is reversed; see questions 17 and 55.]</w:t>
+      </w:r>
+    </w:p>
+    <w:p>
+      <w:pPr>
+        <w:pStyle w:val="BodyText"/>
+        <w:bidi w:val="0"/>
+        <w:jc w:val="left"/>
+        <w:rPr/>
+      </w:pPr>
+      <w:r>
+        <w:rPr/>
+        <w:t>9.6 You may need to complete the payment provider's verification (KYC) for your business. The provider may refuse or close your payout account; we are not responsible for its decisions.</w:t>
       </w:r>
     </w:p>
     <w:p>
@@ -6385,7 +6371,7 @@
             </w:pPr>
             <w:r>
               <w:rPr/>
-              <w:t>Shop name, location (text address), about text, photo, working hours, days off, services and prices, plans you sell, Paystack subaccount code, bank name, last 4 digits of your account number, account name, whether the account name was verified</w:t>
+              <w:t>Shop name, location (text address), about text, photo, working hours, days off, services and prices, plans you sell, payout account reference, bank name, last 4 digits of your account number, account name, whether the account name was verified</w:t>
             </w:r>
           </w:p>
         </w:tc>

</xml_diff>

<commit_message>
Legal wording: credit only when the barber marks a no-show (Terms, Plan terms, Refunds boxes + 2.2); no-show not marked = no refund and no credit; legal pages and pack rebuilt
</commit_message>
<xml_diff>
--- a/legal/legal-pack.docx
+++ b/legal/legal-pack.docx
@@ -2119,7 +2119,7 @@
       </w:pPr>
       <w:r>
         <w:rPr/>
-        <w:t xml:space="preserve">If you miss a visit that you paid for, you get no refund. You get one credit with the same barber. You cannot cash out a credit. </w:t>
+        <w:t xml:space="preserve">If you miss a visit that you paid for, you get no refund. When your barber marks it a no-show, you get one credit with the same barber. You cannot cash out a credit. </w:t>
       </w:r>
     </w:p>
     <w:p>
@@ -10368,7 +10368,7 @@
       </w:pPr>
       <w:r>
         <w:rPr/>
-        <w:t xml:space="preserve">If you miss a visit that you paid for, you get no refund. You get one credit with the same barber instead. It lasts 30 days. You cannot cash it out. </w:t>
+        <w:t xml:space="preserve">If you miss a visit that you paid for, you get no refund. When your barber marks it a no-show, you get one credit with the same barber instead. It lasts 30 days. You cannot cash it out. </w:t>
       </w:r>
     </w:p>
     <w:p>
@@ -10390,7 +10390,29 @@
       </w:pPr>
       <w:r>
         <w:rPr/>
-        <w:t xml:space="preserve">If the barber cannot serve you, you get a refund. If you pay twice, or your payment comes after someone else took that time, you also get a refund. If your payment comes late but the time is still free, the booking is confirmed. </w:t>
+        <w:t xml:space="preserve">If the barber does not mark a no-show, there is no refund and no credit. </w:t>
+      </w:r>
+    </w:p>
+    <w:p>
+      <w:pPr>
+        <w:pStyle w:val="BodyText"/>
+        <w:numPr>
+          <w:ilvl w:val="0"/>
+          <w:numId w:val="17"/>
+        </w:numPr>
+        <w:tabs>
+          <w:tab w:val="clear" w:pos="709"/>
+          <w:tab w:val="left" w:pos="709" w:leader="none"/>
+        </w:tabs>
+        <w:bidi w:val="0"/>
+        <w:spacing w:before="0" w:after="0"/>
+        <w:ind w:hanging="283" w:left="709"/>
+        <w:jc w:val="left"/>
+        <w:rPr/>
+      </w:pPr>
+      <w:r>
+        <w:rPr/>
+        <w:t xml:space="preserve">If the barber cannot serve you (the barber marks "Not served"), you get a refund. If you pay twice, or your payment comes after someone else took that time, you also get a refund. If your payment comes late but the time is still free, the booking is confirmed. </w:t>
       </w:r>
     </w:p>
     <w:p>
@@ -11166,7 +11188,7 @@
       </w:pPr>
       <w:r>
         <w:rPr/>
-        <w:t>2.2 After the cut-off the booking is "locked" so the barber's time is protected. If something genuinely came up, contact the barber; the barber may mark the booking "Not served" or leave it for you to arrive.</w:t>
+        <w:t>2.2 After the cut-off the booking is "locked" so the barber's time is protected. If something urgent came up, call or message your barber (the app shows the barber's phone and WhatsApp on a paid upcoming booking). The barber decides: the barber may mark the booking "Not served" (then a refund, or your plan session or credit comes back, as in section 5), may wait for you, or may leave it for you to arrive. If you do not come and the barber marks a no-show, section 4 applies. A credit for a missed visit comes only when the barber marks a no-show.</w:t>
       </w:r>
     </w:p>
     <w:p>
@@ -12494,7 +12516,7 @@
       </w:pPr>
       <w:r>
         <w:rPr/>
-        <w:t xml:space="preserve">If you miss a visit, the session counts as used. You get one credit with the same barber. </w:t>
+        <w:t xml:space="preserve">If you miss a visit, the session counts as used. When your barber marks it a no-show, you get one credit with the same barber. </w:t>
       </w:r>
     </w:p>
     <w:p>

</xml_diff>

<commit_message>
Payment follow-ups: list/detail match, auth no Paystack wait, double-pay block, refund wording, help alert (#2)
* Payment follow-ups: list matches detail page, no Paystack wait on auth, keep flagged plan payments, block double pay, refund wording, help alert is not a complaint

* Legal wording: credit only when the barber marks a no-show (Terms, Plan terms, Refunds boxes + 2.2); no-show not marked = no refund and no credit; legal pages and pack rebuilt

* Follow-ups: help escalation only for live bookings, reschedule uses booking gates + closes waitlist, help alert outside report cap, OTP per-IP cap 60 + derived HMAC key, single /pay guard; legal 2.2 back to PR #1 wording; tests

---------

Co-authored-by: boopuddin64-netizen <boopuddin64-netizen@users.noreply.github.com>
</commit_message>
<xml_diff>
--- a/legal/legal-pack.docx
+++ b/legal/legal-pack.docx
@@ -2119,7 +2119,7 @@
       </w:pPr>
       <w:r>
         <w:rPr/>
-        <w:t xml:space="preserve">If you miss a visit that you paid for, you get no refund. You get one credit with the same barber. You cannot cash out a credit. </w:t>
+        <w:t xml:space="preserve">If you miss a visit that you paid for, you get no refund. When your barber marks it a no-show, you get one credit with the same barber. You cannot cash out a credit. </w:t>
       </w:r>
     </w:p>
     <w:p>
@@ -10368,7 +10368,7 @@
       </w:pPr>
       <w:r>
         <w:rPr/>
-        <w:t xml:space="preserve">If you miss a visit that you paid for, you get no refund. You get one credit with the same barber instead. It lasts 30 days. You cannot cash it out. </w:t>
+        <w:t xml:space="preserve">If you miss a visit that you paid for, you get no refund. When your barber marks it a no-show, you get one credit with the same barber instead. It lasts 30 days. You cannot cash it out. </w:t>
       </w:r>
     </w:p>
     <w:p>
@@ -10390,7 +10390,29 @@
       </w:pPr>
       <w:r>
         <w:rPr/>
-        <w:t xml:space="preserve">If the barber cannot serve you, you get a refund. If you pay twice, or your payment comes after someone else took that time, you also get a refund. If your payment comes late but the time is still free, the booking is confirmed. </w:t>
+        <w:t xml:space="preserve">If the barber does not mark a no-show, there is no refund and no credit. </w:t>
+      </w:r>
+    </w:p>
+    <w:p>
+      <w:pPr>
+        <w:pStyle w:val="BodyText"/>
+        <w:numPr>
+          <w:ilvl w:val="0"/>
+          <w:numId w:val="17"/>
+        </w:numPr>
+        <w:tabs>
+          <w:tab w:val="clear" w:pos="709"/>
+          <w:tab w:val="left" w:pos="709" w:leader="none"/>
+        </w:tabs>
+        <w:bidi w:val="0"/>
+        <w:spacing w:before="0" w:after="0"/>
+        <w:ind w:hanging="283" w:left="709"/>
+        <w:jc w:val="left"/>
+        <w:rPr/>
+      </w:pPr>
+      <w:r>
+        <w:rPr/>
+        <w:t xml:space="preserve">If the barber cannot serve you (the barber marks "Not served"), you get a refund. If you pay twice, or your payment comes after someone else took that time, you also get a refund. If your payment comes late but the time is still free, the booking is confirmed. </w:t>
       </w:r>
     </w:p>
     <w:p>
@@ -11166,7 +11188,7 @@
       </w:pPr>
       <w:r>
         <w:rPr/>
-        <w:t>2.2 After the cut-off the booking is "locked" so the barber's time is protected. If something genuinely came up, contact the barber; the barber may mark the booking "Not served" or leave it for you to arrive.</w:t>
+        <w:t>2.2 After the cut-off the booking is "locked" so the barber's time is protected. If something urgent came up, call or message your barber (the app shows the barber's phone and WhatsApp on a paid upcoming booking). The barber decides: the barber may mark the booking "Not served" (then a refund, or your plan session or credit comes back, as in section 5), may wait for you, or may leave it for you to arrive. If you do not come and the barber marks a no-show, section 4 applies. A credit comes only when the barber marks a no-show.</w:t>
       </w:r>
     </w:p>
     <w:p>
@@ -12494,7 +12516,7 @@
       </w:pPr>
       <w:r>
         <w:rPr/>
-        <w:t xml:space="preserve">If you miss a visit, the session counts as used. You get one credit with the same barber. </w:t>
+        <w:t xml:space="preserve">If you miss a visit, the session counts as used. When your barber marks it a no-show, you get one credit with the same barber. </w:t>
       </w:r>
     </w:p>
     <w:p>

</xml_diff>

<commit_message>
Legal pack regenerated after rebase on main
</commit_message>
<xml_diff>
--- a/legal/legal-pack.docx
+++ b/legal/legal-pack.docx
@@ -2119,7 +2119,7 @@
       </w:pPr>
       <w:r>
         <w:rPr/>
-        <w:t xml:space="preserve">If you miss a visit that you paid for, you get no refund. You get one credit with the same barber. You cannot cash out a credit. </w:t>
+        <w:t xml:space="preserve">If you miss a visit that you paid for, you get no refund. When your barber marks it a no-show, you get one credit with the same barber. You cannot cash out a credit. </w:t>
       </w:r>
     </w:p>
     <w:p>
@@ -11054,6 +11054,28 @@
       </w:pPr>
       <w:r>
         <w:rPr/>
+        <w:t xml:space="preserve">If the barber does not mark a no-show, there is no refund and no credit. </w:t>
+      </w:r>
+    </w:p>
+    <w:p>
+      <w:pPr>
+        <w:pStyle w:val="BodyText"/>
+        <w:numPr>
+          <w:ilvl w:val="0"/>
+          <w:numId w:val="18"/>
+        </w:numPr>
+        <w:tabs>
+          <w:tab w:val="clear" w:pos="709"/>
+          <w:tab w:val="left" w:pos="709" w:leader="none"/>
+        </w:tabs>
+        <w:bidi w:val="0"/>
+        <w:spacing w:before="0" w:after="0"/>
+        <w:ind w:hanging="283" w:left="709"/>
+        <w:jc w:val="left"/>
+        <w:rPr/>
+      </w:pPr>
+      <w:r>
+        <w:rPr/>
         <w:t xml:space="preserve">If the barber cannot serve you (the barber marks "Not served"), you get a refund. If you pay twice, or your payment comes after someone else took that time, you also get a refund. If your payment comes late but the time is still free, the booking is confirmed. </w:t>
       </w:r>
     </w:p>
@@ -13355,7 +13377,7 @@
       </w:pPr>
       <w:r>
         <w:rPr/>
-        <w:t xml:space="preserve">If you miss a visit, the session counts as used. You get one credit with the same barber. </w:t>
+        <w:t xml:space="preserve">If you miss a visit, the session counts as used. When your barber marks it a no-show, you get one credit with the same barber. </w:t>
       </w:r>
     </w:p>
     <w:p>

</xml_diff>

<commit_message>
Docs: public-settings no longer serves plan limits or loyalty; pack regenerated
</commit_message>
<xml_diff>
--- a/legal/legal-pack.docx
+++ b/legal/legal-pack.docx
@@ -27359,7 +27359,7 @@
             </w:pPr>
             <w:r>
               <w:rPr/>
-              <w:t>Cancel lock, how long a pay-now try stays open, credit expiry, refund auto-approve hours, fee %, flat fee, commission factor, liability cap, plan limits, retention periods and document versions are all admin settings (Controls page and Platform rules), validated server-side and audited (</w:t>
+              <w:t>Cancel lock, how long a pay-now try stays open, credit expiry, refund auto-approve hours, fee %, flat fee, commission factor, liability cap, plan limits, loyalty, retention periods and document versions are all admin settings (Controls page and Platform rules), validated server-side and audited (</w:t>
             </w:r>
             <w:r>
               <w:rPr>
@@ -27369,7 +27369,7 @@
             </w:r>
             <w:r>
               <w:rPr/>
-              <w:t xml:space="preserve"> with before/after). The public pages (Terms, Privacy, Refunds, Plan Terms, Cookies, Barber Agreement) fill these numbers in live from </w:t>
+              <w:t xml:space="preserve"> with before/after). The public pages (Terms, Privacy, Refunds, Plan Terms, Cookies, Barber Agreement) fill in live only the published ones (cancel lock, payment hold, credit expiry, liability cap, retention periods, document versions) from </w:t>
             </w:r>
             <w:r>
               <w:rPr>
@@ -27379,7 +27379,7 @@
             </w:r>
             <w:r>
               <w:rPr/>
-              <w:t xml:space="preserve"> (no secrets, cached 60 s). The liability cap is </w:t>
+              <w:t xml:space="preserve"> (no secrets, cached 60 s). Plan limits and loyalty are not published there. The liability cap is </w:t>
             </w:r>
             <w:r>
               <w:rPr>
@@ -27497,7 +27497,7 @@
             </w:r>
             <w:r>
               <w:rPr/>
-              <w:t xml:space="preserve"> serves only the numbers the public pages quote (cancel window, payment hold, credit expiry, plan limits, retention periods, liability cap, loyalty, versions). Fees, charge, the processing-fee split, commission, payout floor, debt limits and the refund auto-approve time are NOT served; </w:t>
+              <w:t xml:space="preserve"> serves only the numbers the public pages quote (cancel window, payment hold, credit expiry, retention periods, liability cap, versions; a test pins the exact key list). Plan limits, the plan refund setting, loyalty numbers, fees, charge, the processing-fee split, commission, payout floor, debt limits and the refund auto-approve time are NOT served; </w:t>
             </w:r>
             <w:r>
               <w:rPr>

</xml_diff>